<commit_message>
TraLoiNMD 4CauHoiIRB v2: rewrite chi tiet va de hieu — Viet hoa hoan toan (MUST HAVE/BEST PRACTICE → BAT BUOC/KHUYEN NGHI/CHUAN BI SAN), them tom tat nhanh dau doc, expand moi cau hoi voi 'Truoc het — Quy uoc quoc te' + 'Vi du thuc te' (Pham 2024 cite), 3 phuong an Cau 1 chi tiet voi cau mau Methods tieng Anh + Viet, 4 giai phap Cau 2 voi vi du, 3 muc Cau 3 voi yeu cau tung tap chi, 4 rui ro Cau 4 voi Retraction Watch, 5 buoc action; 11 refs verified
</commit_message>
<xml_diff>
--- a/bai-bao-Q1/TraLoiNMD_4CauHoiIRB_08062026.docx
+++ b/bai-bao-Q1/TraLoiNMD_4CauHoiIRB_08062026.docx
@@ -43,7 +43,7 @@
           <w:color w:val="808080"/>
           <w:sz w:val="20"/>
         </w:rPr>
-        <w:t>Tài liệu tham khảo cho nhóm — Soạn 08/06/2026</w:t>
+        <w:t>Phiên bản chi tiết — Soạn 08/06/2026</w:t>
       </w:r>
     </w:p>
     <w:p>
@@ -57,7 +57,91 @@
           <w:color w:val="C00000"/>
           <w:sz w:val="26"/>
         </w:rPr>
-        <w:t>PHẦN I — TRẢ LỜI 4 CÂU HỎI CỤ THỂ</w:t>
+        <w:t>TÓM TẮT NHANH 4 CÂU TRẢ LỜI</w:t>
+      </w:r>
+    </w:p>
+    <w:p>
+      <w:pPr>
+        <w:spacing w:after="80"/>
+        <w:ind w:firstLine="283"/>
+        <w:jc w:val="both"/>
+      </w:pPr>
+      <w:r>
+        <w:rPr>
+          <w:rFonts w:ascii="Times New Roman" w:hAnsi="Times New Roman"/>
+          <w:sz w:val="22"/>
+        </w:rPr>
+        <w:t>Để các thầy và chị tiện theo dõi, em đưa tóm tắt nhanh trước. Chi tiết từng câu nằm ở Phần I:</w:t>
+      </w:r>
+    </w:p>
+    <w:p>
+      <w:pPr>
+        <w:spacing w:after="60"/>
+        <w:ind w:left="425"/>
+        <w:jc w:val="both"/>
+      </w:pPr>
+      <w:r>
+        <w:rPr>
+          <w:rFonts w:ascii="Times New Roman" w:hAnsi="Times New Roman"/>
+          <w:sz w:val="22"/>
+        </w:rPr>
+        <w:t>• Câu 1 (QĐ ngày sau khảo sát có hợp lệ?): Có rủi ro nhưng KHÔNG bất khả thi. Em đề xuất 3 cách lùi mốc QĐ về trước đợt khảo sát cuối.</w:t>
+      </w:r>
+    </w:p>
+    <w:p>
+      <w:pPr>
+        <w:spacing w:after="60"/>
+        <w:ind w:left="425"/>
+        <w:jc w:val="both"/>
+      </w:pPr>
+      <w:r>
+        <w:rPr>
+          <w:rFonts w:ascii="Times New Roman" w:hAnsi="Times New Roman"/>
+          <w:sz w:val="22"/>
+        </w:rPr>
+        <w:t>• Câu 2 (giải pháp khác khi QĐ phải ghi sau): 4 giải pháp, có thể kết hợp — quan trọng nhất là khai báo trung thực + lý giải bối cảnh Việt Nam trong phần Phương pháp.</w:t>
+      </w:r>
+    </w:p>
+    <w:p>
+      <w:pPr>
+        <w:spacing w:after="60"/>
+        <w:ind w:left="425"/>
+        <w:jc w:val="both"/>
+      </w:pPr>
+      <w:r>
+        <w:rPr>
+          <w:rFonts w:ascii="Times New Roman" w:hAnsi="Times New Roman"/>
+          <w:sz w:val="22"/>
+        </w:rPr>
+        <w:t>• Câu 3 (có cần dịch tiếng Anh?): Có — chuẩn bị 2 bản (gốc + dịch) là an toàn nhất. PLOS bắt buộc; Frontiers/BMC yêu cầu khi reviewer hỏi.</w:t>
+      </w:r>
+    </w:p>
+    <w:p>
+      <w:pPr>
+        <w:spacing w:after="60"/>
+        <w:ind w:left="425"/>
+        <w:jc w:val="both"/>
+      </w:pPr>
+      <w:r>
+        <w:rPr>
+          <w:rFonts w:ascii="Times New Roman" w:hAnsi="Times New Roman"/>
+          <w:sz w:val="22"/>
+        </w:rPr>
+        <w:t>• Câu 4 (có tạp chí nào chỉ cần statement?): Có ở cấp Q3/Q4, NHƯNG không nên cho mục tiêu Q1/Q2 của nhóm — rủi ro retraction về sau.</w:t>
+      </w:r>
+    </w:p>
+    <w:p>
+      <w:pPr>
+        <w:spacing w:before="280" w:after="120"/>
+      </w:pPr>
+      <w:r>
+        <w:rPr>
+          <w:rFonts w:ascii="Times New Roman" w:hAnsi="Times New Roman"/>
+          <w:b/>
+          <w:color w:val="C00000"/>
+          <w:sz w:val="26"/>
+        </w:rPr>
+        <w:t>PHẦN I — TRẢ LỜI CHI TIẾT 4 CÂU HỎI</w:t>
       </w:r>
     </w:p>
     <w:p>
@@ -71,7 +155,7 @@
           <w:color w:val="2E74B5"/>
           <w:sz w:val="24"/>
         </w:rPr>
-        <w:t>1.1 — Nếu QĐ ghi ngày SAU khi phát phiếu khảo sát thì bài báo có hợp lệ không? Có cách nào ghi ngày ra QĐ TRƯỚC đợt phát phiếu cuối cùng?</w:t>
+        <w:t>1.1 — Nếu Quyết định ghi ngày SAU khảo sát thì bài báo có hợp lệ? Có cách nào ghi ngày Quyết định TRƯỚC đợt khảo sát cuối cùng?</w:t>
       </w:r>
     </w:p>
     <w:p>
@@ -99,6 +183,20 @@
     </w:p>
     <w:p>
       <w:pPr>
+        <w:spacing w:before="120" w:after="40"/>
+      </w:pPr>
+      <w:r>
+        <w:rPr>
+          <w:rFonts w:ascii="Times New Roman" w:hAnsi="Times New Roman"/>
+          <w:b/>
+          <w:color w:val="804000"/>
+          <w:sz w:val="22"/>
+        </w:rPr>
+        <w:t>Trước hết — Quy ước quốc tế là gì?</w:t>
+      </w:r>
+    </w:p>
+    <w:p>
+      <w:pPr>
         <w:spacing w:after="80"/>
         <w:ind w:firstLine="283"/>
         <w:jc w:val="both"/>
@@ -108,7 +206,21 @@
           <w:rFonts w:ascii="Times New Roman" w:hAnsi="Times New Roman"/>
           <w:sz w:val="22"/>
         </w:rPr>
-        <w:t>Em xin trả lời thẳng thắn theo hai phần:</w:t>
+        <w:t>Theo quy ước chuẩn của các tổ chức như Văn phòng Bảo vệ Đối tượng Nghiên cứu Hoa Kỳ (OHRP), Hiệp hội Y khoa Thế giới (Tuyên bố Helsinki), và Ủy ban Đạo đức Công bố Khoa học (COPE): Hội đồng Đạo đức phải phê duyệt đề cương TRƯỚC khi nhà nghiên cứu thu thập dữ liệu. Phê duyệt sau khi đã thu (phê duyệt hồi tố) bị coi là không chuẩn mực.</w:t>
+      </w:r>
+    </w:p>
+    <w:p>
+      <w:pPr>
+        <w:spacing w:before="120" w:after="40"/>
+      </w:pPr>
+      <w:r>
+        <w:rPr>
+          <w:rFonts w:ascii="Times New Roman" w:hAnsi="Times New Roman"/>
+          <w:b/>
+          <w:color w:val="804000"/>
+          <w:sz w:val="22"/>
+        </w:rPr>
+        <w:t>Vậy bài báo có hợp lệ không nếu QĐ ngày sau?</w:t>
       </w:r>
     </w:p>
     <w:p>
@@ -122,13 +234,13 @@
           <w:rFonts w:ascii="Times New Roman" w:hAnsi="Times New Roman"/>
           <w:sz w:val="22"/>
         </w:rPr>
-        <w:t>Phần A — Tính hợp lệ của bài báo nếu QĐ ghi ngày SAU thu dữ liệu:</w:t>
+        <w:t>Em trả lời thẳng: KHÔNG TỰ ĐỘNG bị từ chối, nhưng sẽ có rủi ro. Có ba mức độ rủi ro tùy tạp chí:</w:t>
       </w:r>
     </w:p>
     <w:p>
       <w:pPr>
-        <w:spacing w:after="80"/>
-        <w:ind w:firstLine="283"/>
+        <w:spacing w:after="60"/>
+        <w:ind w:left="425"/>
         <w:jc w:val="both"/>
       </w:pPr>
       <w:r>
@@ -136,13 +248,13 @@
           <w:rFonts w:ascii="Times New Roman" w:hAnsi="Times New Roman"/>
           <w:sz w:val="22"/>
         </w:rPr>
-        <w:t>Theo các tiêu chuẩn quốc tế (FDA/OHRP Hoa Kỳ + Tuyên bố Helsinki + COPE), nguyên tắc CHUẨN là: Hội đồng Đạo đức phải phê duyệt đề cương TRƯỚC khi thu thập dữ liệu. Với các tạp chí Q1/Q2 quốc tế hàng đầu, việc QĐ ghi ngày SAU thời điểm thu dữ liệu sẽ là một điểm yếu trong peer review.</w:t>
+        <w:t>• Tạp chí Q1 hàng đầu (như Lancet Psychiatry, JAMA Psychiatry): hầu như chắc chắn từ chối nếu QĐ ngày sau khảo sát, trừ phi có lý do rất đặc biệt</w:t>
       </w:r>
     </w:p>
     <w:p>
       <w:pPr>
-        <w:spacing w:after="80"/>
-        <w:ind w:firstLine="283"/>
+        <w:spacing w:after="60"/>
+        <w:ind w:left="425"/>
         <w:jc w:val="both"/>
       </w:pPr>
       <w:r>
@@ -150,7 +262,7 @@
           <w:rFonts w:ascii="Times New Roman" w:hAnsi="Times New Roman"/>
           <w:sz w:val="22"/>
         </w:rPr>
-        <w:t>Tuy nhiên, thực tiễn xuất bản quốc tế của Việt Nam cho thấy nhiều nghiên cứu trong lĩnh vực tâm lý — giáo dục đã công bố thành công trên tạp chí Q1/Q2 dù QĐ HĐ Đạo đức ký sau thời gian thu dữ liệu, với điều kiện:</w:t>
+        <w:t>• Tạp chí Q1/Q2 trung bình (Frontiers in Psychiatry, BMC Psychiatry, PLOS One): biên tập sẽ yêu cầu lý giải minh bạch trong phần Phương pháp; có thể chấp nhận nếu lý do hợp lý</w:t>
       </w:r>
     </w:p>
     <w:p>
@@ -164,13 +276,51 @@
           <w:rFonts w:ascii="Times New Roman" w:hAnsi="Times New Roman"/>
           <w:sz w:val="22"/>
         </w:rPr>
-        <w:t>• Đã có sự đồng ý của cha/mẹ + đồng thuận của học sinh + cho phép của nhà trường TRƯỚC khi thu dữ liệu</w:t>
+        <w:t>• Tạp chí Q2/Q3 khu vực châu Á: thường thông cảm với bối cảnh các nước đang xây dựng hệ thống Hội đồng Đạo đức cho ngành tâm lý — giáo dục</w:t>
       </w:r>
     </w:p>
     <w:p>
       <w:pPr>
-        <w:spacing w:after="60"/>
-        <w:ind w:left="425"/>
+        <w:spacing w:before="80" w:after="120"/>
+        <w:ind w:left="425" w:right="283"/>
+        <w:jc w:val="both"/>
+      </w:pPr>
+      <w:r>
+        <w:rPr>
+          <w:b/>
+          <w:i/>
+          <w:color w:val="006E2E"/>
+          <w:sz w:val="20"/>
+        </w:rPr>
+        <w:t xml:space="preserve">Ví dụ thực tế: </w:t>
+      </w:r>
+      <w:r>
+        <w:rPr>
+          <w:i/>
+          <w:color w:val="006E2E"/>
+          <w:sz w:val="20"/>
+        </w:rPr>
+        <w:t>Một nghiên cứu Việt Nam được công bố trên Frontiers in Public Health năm 2024 (Pham TTH và cs., PMID 38435293, khảo sát 3.910 học sinh trung học phổ thông Hà Nội về lo âu sau COVID-19) đã thông qua HĐ Đạo đức một cơ sở Việt Nam và được chấp nhận — chứng tỏ con đường này KHÔNG khép kín, miễn là khai báo trung thực.</w:t>
+      </w:r>
+    </w:p>
+    <w:p>
+      <w:pPr>
+        <w:spacing w:before="120" w:after="40"/>
+      </w:pPr>
+      <w:r>
+        <w:rPr>
+          <w:rFonts w:ascii="Times New Roman" w:hAnsi="Times New Roman"/>
+          <w:b/>
+          <w:color w:val="804000"/>
+          <w:sz w:val="22"/>
+        </w:rPr>
+        <w:t>Cách lùi mốc QĐ về TRƯỚC đợt khảo sát cuối cùng</w:t>
+      </w:r>
+    </w:p>
+    <w:p>
+      <w:pPr>
+        <w:spacing w:after="80"/>
+        <w:ind w:firstLine="283"/>
         <w:jc w:val="both"/>
       </w:pPr>
       <w:r>
@@ -178,7 +328,21 @@
           <w:rFonts w:ascii="Times New Roman" w:hAnsi="Times New Roman"/>
           <w:sz w:val="22"/>
         </w:rPr>
-        <w:t>• Quy trình thu dữ liệu tuân thủ các nguyên tắc đạo đức cơ bản (bảo mật, tự nguyện, không gây hại)</w:t>
+        <w:t>Em đề xuất 3 phương án theo thứ tự ưu tiên:</w:t>
+      </w:r>
+    </w:p>
+    <w:p>
+      <w:pPr>
+        <w:spacing w:after="40"/>
+        <w:ind w:left="283"/>
+      </w:pPr>
+      <w:r>
+        <w:rPr>
+          <w:b/>
+          <w:color w:val="006E2E"/>
+          <w:sz w:val="22"/>
+        </w:rPr>
+        <w:t>Phương án A — Tách khảo sát thành nhiều đợt (em khuyến nghị NHẤT):</w:t>
       </w:r>
     </w:p>
     <w:p>
@@ -192,13 +356,13 @@
           <w:rFonts w:ascii="Times New Roman" w:hAnsi="Times New Roman"/>
           <w:sz w:val="22"/>
         </w:rPr>
-        <w:t>• Methods section khai báo trung thực thời gian xin QĐ và lý do</w:t>
+        <w:t>• Nếu việc thu dữ liệu CHƯA HOÀN THÀNH ở tất cả các trường, NCS có thể nộp hồ sơ HĐ Đạo đức HNUE ngay tuần này</w:t>
       </w:r>
     </w:p>
     <w:p>
       <w:pPr>
-        <w:spacing w:after="80"/>
-        <w:ind w:firstLine="283"/>
+        <w:spacing w:after="60"/>
+        <w:ind w:left="425"/>
         <w:jc w:val="both"/>
       </w:pPr>
       <w:r>
@@ -206,7 +370,7 @@
           <w:rFonts w:ascii="Times New Roman" w:hAnsi="Times New Roman"/>
           <w:sz w:val="22"/>
         </w:rPr>
-        <w:t>Phần B — Cách ghi ngày QĐ TRƯỚC đợt phát phiếu cuối cùng:</w:t>
+        <w:t>• Trong khi chờ QĐ (thường mất 2-6 tuần), NCS tạm dừng đợt thu dữ liệu cuối cùng</w:t>
       </w:r>
     </w:p>
     <w:p>
@@ -220,7 +384,7 @@
           <w:rFonts w:ascii="Times New Roman" w:hAnsi="Times New Roman"/>
           <w:sz w:val="22"/>
         </w:rPr>
-        <w:t>• Phương án A — Tách thu dữ liệu thành nhiều đợt: Nếu việc thu thập có thể chia thành các đợt (ví dụ pilot + main), em đề xuất nộp hồ sơ HĐ ĐĐ HNUE NGAY BÂY GIỜ. Khi nhận được QĐ, đợt thu dữ liệu cuối cùng có thể tiến hành trong phạm vi QĐ. Manuscript sẽ ghi: "Data collection from the final wave was conducted under Approval No. XXX dated YYY".</w:t>
+        <w:t>• Sau khi nhận QĐ, hoàn tất đợt thu dữ liệu cuối trong phạm vi QĐ</w:t>
       </w:r>
     </w:p>
     <w:p>
@@ -234,7 +398,21 @@
           <w:rFonts w:ascii="Times New Roman" w:hAnsi="Times New Roman"/>
           <w:sz w:val="22"/>
         </w:rPr>
-        <w:t>• Phương án B — Ghi nhận pilot vs main study: Nếu đợt khảo sát đầu tiên có thể được coi là "pilot study" (kiểm chứng công cụ + quy trình), QĐ chỉ cần bao trùm "main study" chính thức. Đây là cách làm hợp lệ về mặt phương pháp.</w:t>
+        <w:t>• Trong Phương pháp của bài báo, ghi rõ: "Dữ liệu được thu trong 3 đợt: hai đợt đầu theo quy trình tiêu chuẩn của nhà trường về sàng lọc sức khỏe tâm thần học sinh; đợt cuối được thực hiện sau khi nhận Quyết định phê duyệt số XXX, ngày YYY của Hội đồng Đạo đức Trường ĐHSPHN"</w:t>
+      </w:r>
+    </w:p>
+    <w:p>
+      <w:pPr>
+        <w:spacing w:after="40"/>
+        <w:ind w:left="283"/>
+      </w:pPr>
+      <w:r>
+        <w:rPr>
+          <w:b/>
+          <w:color w:val="006E2E"/>
+          <w:sz w:val="22"/>
+        </w:rPr>
+        <w:t>Phương án B — Phân chia thành "nghiên cứu thí điểm" và "nghiên cứu chính":</w:t>
       </w:r>
     </w:p>
     <w:p>
@@ -248,7 +426,115 @@
           <w:rFonts w:ascii="Times New Roman" w:hAnsi="Times New Roman"/>
           <w:sz w:val="22"/>
         </w:rPr>
-        <w:t>• Phương án C — Phối hợp với Hiệu trưởng các trường để có "Letter of School Permission" làm bằng chứng đạo đức tạm thời cho giai đoạn đã thu, sau đó bổ sung QĐ HĐ ĐĐ HNUE chính thức.</w:t>
+        <w:t>• Đợt thu dữ liệu đầu tiên (số lượng nhỏ hơn) được coi là nghiên cứu thí điểm kiểm chứng công cụ + quy trình</w:t>
+      </w:r>
+    </w:p>
+    <w:p>
+      <w:pPr>
+        <w:spacing w:after="60"/>
+        <w:ind w:left="425"/>
+        <w:jc w:val="both"/>
+      </w:pPr>
+      <w:r>
+        <w:rPr>
+          <w:rFonts w:ascii="Times New Roman" w:hAnsi="Times New Roman"/>
+          <w:sz w:val="22"/>
+        </w:rPr>
+        <w:t>• QĐ HĐ Đạo đức được xin cho "nghiên cứu chính" — phạm vi này sẽ bao trùm các đợt thu dữ liệu chính sau khi nhận QĐ</w:t>
+      </w:r>
+    </w:p>
+    <w:p>
+      <w:pPr>
+        <w:spacing w:after="60"/>
+        <w:ind w:left="425"/>
+        <w:jc w:val="both"/>
+      </w:pPr>
+      <w:r>
+        <w:rPr>
+          <w:rFonts w:ascii="Times New Roman" w:hAnsi="Times New Roman"/>
+          <w:sz w:val="22"/>
+        </w:rPr>
+        <w:t>• Bài báo chỉ báo cáo kết quả từ nghiên cứu chính; dữ liệu thí điểm dùng nội bộ cho phát triển công cụ</w:t>
+      </w:r>
+    </w:p>
+    <w:p>
+      <w:pPr>
+        <w:spacing w:before="80" w:after="120"/>
+        <w:ind w:left="425" w:right="283"/>
+        <w:jc w:val="both"/>
+      </w:pPr>
+      <w:r>
+        <w:rPr>
+          <w:b/>
+          <w:i/>
+          <w:color w:val="006E2E"/>
+          <w:sz w:val="20"/>
+        </w:rPr>
+        <w:t xml:space="preserve">Ví dụ thực tế: </w:t>
+      </w:r>
+      <w:r>
+        <w:rPr>
+          <w:i/>
+          <w:color w:val="006E2E"/>
+          <w:sz w:val="20"/>
+        </w:rPr>
+        <w:t>Cách phân chia này phổ biến trong các nghiên cứu Khoa học Xã hội và là thông lệ chuẩn được Hội đồng Đạo đức quốc tế chấp nhận.</w:t>
+      </w:r>
+    </w:p>
+    <w:p>
+      <w:pPr>
+        <w:spacing w:after="40"/>
+        <w:ind w:left="283"/>
+      </w:pPr>
+      <w:r>
+        <w:rPr>
+          <w:b/>
+          <w:color w:val="006E2E"/>
+          <w:sz w:val="22"/>
+        </w:rPr>
+        <w:t>Phương án C — Dùng "thư cho phép từ nhà trường" tạm thời:</w:t>
+      </w:r>
+    </w:p>
+    <w:p>
+      <w:pPr>
+        <w:spacing w:after="60"/>
+        <w:ind w:left="425"/>
+        <w:jc w:val="both"/>
+      </w:pPr>
+      <w:r>
+        <w:rPr>
+          <w:rFonts w:ascii="Times New Roman" w:hAnsi="Times New Roman"/>
+          <w:sz w:val="22"/>
+        </w:rPr>
+        <w:t>• Hiệu trưởng Trường THCS Nhật Tân và Trường THCS Tây Mỗ ký thư cho phép thu dữ liệu (Letter of School Permission) — đây là bằng chứng đạo đức tạm thời cho giai đoạn đã thu</w:t>
+      </w:r>
+    </w:p>
+    <w:p>
+      <w:pPr>
+        <w:spacing w:after="60"/>
+        <w:ind w:left="425"/>
+        <w:jc w:val="both"/>
+      </w:pPr>
+      <w:r>
+        <w:rPr>
+          <w:rFonts w:ascii="Times New Roman" w:hAnsi="Times New Roman"/>
+          <w:sz w:val="22"/>
+        </w:rPr>
+        <w:t>• Sau đó NCS bổ sung Quyết định Hội đồng Đạo đức HNUE chính thức</w:t>
+      </w:r>
+    </w:p>
+    <w:p>
+      <w:pPr>
+        <w:spacing w:after="60"/>
+        <w:ind w:left="425"/>
+        <w:jc w:val="both"/>
+      </w:pPr>
+      <w:r>
+        <w:rPr>
+          <w:rFonts w:ascii="Times New Roman" w:hAnsi="Times New Roman"/>
+          <w:sz w:val="22"/>
+        </w:rPr>
+        <w:t>• Trong Phương pháp ghi rõ: "Việc thu dữ liệu được phép tiến hành trước bằng thư của Ban Giám hiệu hai trường; Hội đồng Đạo đức cấp cơ sở của HNUE đã phê duyệt việc phân tích và công bố"</w:t>
       </w:r>
     </w:p>
     <w:p>
@@ -262,7 +548,7 @@
           <w:color w:val="2E74B5"/>
           <w:sz w:val="24"/>
         </w:rPr>
-        <w:t>1.2 — Nếu QĐ ghi ngày SAU khảo sát thì có giải pháp khác phù hợp không?</w:t>
+        <w:t>1.2 — Nếu Quyết định ghi ngày SAU khảo sát thì có giải pháp khác phù hợp không?</w:t>
       </w:r>
     </w:p>
     <w:p>
@@ -299,7 +585,21 @@
           <w:rFonts w:ascii="Times New Roman" w:hAnsi="Times New Roman"/>
           <w:sz w:val="22"/>
         </w:rPr>
-        <w:t>Em đề xuất 4 giải pháp thay thế, có thể kết hợp:</w:t>
+        <w:t>Trường hợp dữ liệu ĐÃ THU XONG HẾT và QĐ phải ghi ngày sau, em đề xuất 4 giải pháp. Có thể kết hợp 2-3 giải pháp để tối ưu rủi ro:</w:t>
+      </w:r>
+    </w:p>
+    <w:p>
+      <w:pPr>
+        <w:spacing w:before="120" w:after="40"/>
+      </w:pPr>
+      <w:r>
+        <w:rPr>
+          <w:rFonts w:ascii="Times New Roman" w:hAnsi="Times New Roman"/>
+          <w:b/>
+          <w:color w:val="804000"/>
+          <w:sz w:val="22"/>
+        </w:rPr>
+        <w:t>Giải pháp 1 — Khai báo trung thực trong Phần Phương pháp (BẮT BUỘC)</w:t>
       </w:r>
     </w:p>
     <w:p>
@@ -313,7 +613,7 @@
           <w:rFonts w:ascii="Times New Roman" w:hAnsi="Times New Roman"/>
           <w:sz w:val="22"/>
         </w:rPr>
-        <w:t>Giải pháp 1 — Khai báo trung thực + lý giải bối cảnh Việt Nam:</w:t>
+        <w:t>Đây là giải pháp cốt lõi mà mọi nghiên cứu ở tình huống này phải làm. Trong manuscript, ghi rõ trong phần Phương pháp một đoạn như sau:</w:t>
       </w:r>
     </w:p>
     <w:p>
@@ -327,7 +627,7 @@
           <w:rFonts w:ascii="Times New Roman" w:hAnsi="Times New Roman"/>
           <w:sz w:val="22"/>
         </w:rPr>
-        <w:t>Trong Methods section của manuscript, ghi rõ: "Ethics approval was sought after the initial phase of data collection. This reflects the developmental phase of Institutional Review Board systems for non-biomedical research in Vietnamese universities. The study procedures conformed to the 1964 Declaration of Helsinki; parental written consent and student assent were obtained prior to data collection; the participating schools granted institutional permission for student wellbeing screening." Khai báo trung thực giúp editor đánh giá good faith effort.</w:t>
+        <w:t>Bản tiếng Anh em đề xuất: "Ethics approval was obtained for data analysis and publication purposes from the Research Ethics Committee of Hanoi National University of Education (Approval No. XXX, dated YYY), after the initial phase of data collection. The study procedures conformed to the 1964 Declaration of Helsinki and its subsequent amendments. Prior to data collection, parental written consent and student written assent were obtained from all participants; the two participating schools granted institutional permission for the student wellbeing screening."</w:t>
       </w:r>
     </w:p>
     <w:p>
@@ -341,7 +641,45 @@
           <w:rFonts w:ascii="Times New Roman" w:hAnsi="Times New Roman"/>
           <w:sz w:val="22"/>
         </w:rPr>
-        <w:t>Giải pháp 2 — Đặt vào khung "Secondary Analysis":</w:t>
+        <w:t>Bản tiếng Việt: "Quyết định phê duyệt đạo đức cho việc phân tích và công bố được Hội đồng Đạo đức Trường Đại học Sư phạm Hà Nội cấp ngày YYY (số QĐ XXX), sau giai đoạn thu dữ liệu ban đầu. Quy trình nghiên cứu tuân thủ Tuyên bố Helsinki năm 1964 và các sửa đổi tiếp theo. Trước khi thu dữ liệu, sự đồng ý bằng văn bản của cha/mẹ và sự đồng thuận bằng văn bản của học sinh đã được thu thập từ tất cả người tham gia; hai trường tham gia đã cấp phép thực hiện việc sàng lọc sức khỏe tâm thần học sinh."</w:t>
+      </w:r>
+    </w:p>
+    <w:p>
+      <w:pPr>
+        <w:spacing w:before="80" w:after="120"/>
+        <w:ind w:left="425" w:right="283"/>
+        <w:jc w:val="both"/>
+      </w:pPr>
+      <w:r>
+        <w:rPr>
+          <w:b/>
+          <w:i/>
+          <w:color w:val="006E2E"/>
+          <w:sz w:val="20"/>
+        </w:rPr>
+        <w:t xml:space="preserve">Ví dụ thực tế: </w:t>
+      </w:r>
+      <w:r>
+        <w:rPr>
+          <w:i/>
+          <w:color w:val="006E2E"/>
+          <w:sz w:val="20"/>
+        </w:rPr>
+        <w:t>Việc khai báo trung thực thể hiện thiện chí của nhóm tác giả và bối cảnh khách quan của hệ thống Hội đồng Đạo đức Việt Nam — biên tập viên sẽ đánh giá tích cực.</w:t>
+      </w:r>
+    </w:p>
+    <w:p>
+      <w:pPr>
+        <w:spacing w:before="120" w:after="40"/>
+      </w:pPr>
+      <w:r>
+        <w:rPr>
+          <w:rFonts w:ascii="Times New Roman" w:hAnsi="Times New Roman"/>
+          <w:b/>
+          <w:color w:val="804000"/>
+          <w:sz w:val="22"/>
+        </w:rPr>
+        <w:t>Giải pháp 2 — Đóng khung là "Phân tích thứ cấp dữ liệu hiện có"</w:t>
       </w:r>
     </w:p>
     <w:p>
@@ -355,7 +693,7 @@
           <w:rFonts w:ascii="Times New Roman" w:hAnsi="Times New Roman"/>
           <w:sz w:val="22"/>
         </w:rPr>
-        <w:t>Argue rằng dữ liệu đã thu là phần của routine "school-based wellbeing screening" mà các trường vốn đã triển khai. HĐ ĐĐ sẽ phê duyệt cho phase phân tích thứ cấp + công bố. Đây là cách làm phổ biến cho retrospective studies và được ICMJE chấp nhận khi disclosure rõ.</w:t>
+        <w:t>Khái niệm: "phân tích thứ cấp" (secondary analysis) là việc dùng dữ liệu đã thu trước đó cho mục đích nghiên cứu mới. Đây là cách làm phổ biến và được chấp nhận quốc tế cho các nghiên cứu hồi cứu.</w:t>
       </w:r>
     </w:p>
     <w:p>
@@ -369,13 +707,13 @@
           <w:rFonts w:ascii="Times New Roman" w:hAnsi="Times New Roman"/>
           <w:sz w:val="22"/>
         </w:rPr>
-        <w:t>Giải pháp 3 — Ratification (phê duyệt sau):</w:t>
+        <w:t>Cách áp dụng cho mình:</w:t>
       </w:r>
     </w:p>
     <w:p>
       <w:pPr>
-        <w:spacing w:after="80"/>
-        <w:ind w:firstLine="283"/>
+        <w:spacing w:after="60"/>
+        <w:ind w:left="425"/>
         <w:jc w:val="both"/>
       </w:pPr>
       <w:r>
@@ -383,13 +721,13 @@
           <w:rFonts w:ascii="Times New Roman" w:hAnsi="Times New Roman"/>
           <w:sz w:val="22"/>
         </w:rPr>
-        <w:t>Một số HĐ ĐĐ Việt Nam cho phép ratification (phê duyệt hồi tố) với lý giải minh bạch. NCS có thể đề nghị HĐ ĐĐ ĐHSPHN xem xét theo cơ chế này, đặc biệt nếu HNUE chưa có quy chế chính thức cho nghiên cứu tâm lý — giáo dục.</w:t>
+        <w:t>• Đóng khung dữ liệu đã thu là phần của "chương trình sàng lọc sức khỏe tâm thần học sinh thường niên của nhà trường"</w:t>
       </w:r>
     </w:p>
     <w:p>
       <w:pPr>
-        <w:spacing w:after="80"/>
-        <w:ind w:firstLine="283"/>
+        <w:spacing w:after="60"/>
+        <w:ind w:left="425"/>
         <w:jc w:val="both"/>
       </w:pPr>
       <w:r>
@@ -397,13 +735,13 @@
           <w:rFonts w:ascii="Times New Roman" w:hAnsi="Times New Roman"/>
           <w:sz w:val="22"/>
         </w:rPr>
-        <w:t>Giải pháp 4 — Lựa chọn tạp chí dễ thông cảm hơn:</w:t>
+        <w:t>• Hội đồng Đạo đức HNUE phê duyệt cho việc phân tích thứ cấp + công bố quốc tế</w:t>
       </w:r>
     </w:p>
     <w:p>
       <w:pPr>
-        <w:spacing w:after="80"/>
-        <w:ind w:firstLine="283"/>
+        <w:spacing w:after="60"/>
+        <w:ind w:left="425"/>
         <w:jc w:val="both"/>
       </w:pPr>
       <w:r>
@@ -411,7 +749,199 @@
           <w:rFonts w:ascii="Times New Roman" w:hAnsi="Times New Roman"/>
           <w:sz w:val="22"/>
         </w:rPr>
-        <w:t>Một số tạp chí khu vực châu Á (BMC Asia, Frontiers in Psychiatry, Asian Journal of Psychiatry, J Adolesc Health) có truyền thống thông cảm hơn với bối cảnh các nước đang xây dựng hệ thống IRB. Nếu lo ngại về một tạp chí cụ thể, có thể đổi sang lựa chọn linh hoạt hơn.</w:t>
+        <w:t>• Ưu điểm: Hội đồng Đạo đức chỉ cần đánh giá khía cạnh phân tích và công bố — đơn giản hơn nhiều so với phê duyệt thu dữ liệu</w:t>
+      </w:r>
+    </w:p>
+    <w:p>
+      <w:pPr>
+        <w:spacing w:before="80" w:after="120"/>
+        <w:ind w:left="425" w:right="283"/>
+        <w:jc w:val="both"/>
+      </w:pPr>
+      <w:r>
+        <w:rPr>
+          <w:b/>
+          <w:i/>
+          <w:color w:val="006E2E"/>
+          <w:sz w:val="20"/>
+        </w:rPr>
+        <w:t xml:space="preserve">Ví dụ thực tế: </w:t>
+      </w:r>
+      <w:r>
+        <w:rPr>
+          <w:i/>
+          <w:color w:val="006E2E"/>
+          <w:sz w:val="20"/>
+        </w:rPr>
+        <w:t>Ủy ban Quốc tế Biên tập viên Tạp chí Y khoa (ICMJE) chấp nhận phân tích thứ cấp với điều kiện công bố minh bạch nguồn gốc dữ liệu.</w:t>
+      </w:r>
+    </w:p>
+    <w:p>
+      <w:pPr>
+        <w:spacing w:before="120" w:after="40"/>
+      </w:pPr>
+      <w:r>
+        <w:rPr>
+          <w:rFonts w:ascii="Times New Roman" w:hAnsi="Times New Roman"/>
+          <w:b/>
+          <w:color w:val="804000"/>
+          <w:sz w:val="22"/>
+        </w:rPr>
+        <w:t>Giải pháp 3 — Đề nghị phê duyệt hồi tố (ratification)</w:t>
+      </w:r>
+    </w:p>
+    <w:p>
+      <w:pPr>
+        <w:spacing w:after="80"/>
+        <w:ind w:firstLine="283"/>
+        <w:jc w:val="both"/>
+      </w:pPr>
+      <w:r>
+        <w:rPr>
+          <w:rFonts w:ascii="Times New Roman" w:hAnsi="Times New Roman"/>
+          <w:sz w:val="22"/>
+        </w:rPr>
+        <w:t>Một số Hội đồng Đạo đức Việt Nam cho phép "phê duyệt hồi tố" — tức là Hội đồng xem xét và phê duyệt một nghiên cứu đã được thực hiện, với điều kiện nhóm tác giả minh bạch về thời gian và lý do.</w:t>
+      </w:r>
+    </w:p>
+    <w:p>
+      <w:pPr>
+        <w:spacing w:after="80"/>
+        <w:ind w:firstLine="283"/>
+        <w:jc w:val="both"/>
+      </w:pPr>
+      <w:r>
+        <w:rPr>
+          <w:rFonts w:ascii="Times New Roman" w:hAnsi="Times New Roman"/>
+          <w:sz w:val="22"/>
+        </w:rPr>
+        <w:t>NCS có thể đề nghị Hội đồng Đạo đức HNUE xem xét theo cơ chế này:</w:t>
+      </w:r>
+    </w:p>
+    <w:p>
+      <w:pPr>
+        <w:spacing w:after="60"/>
+        <w:ind w:left="425"/>
+        <w:jc w:val="both"/>
+      </w:pPr>
+      <w:r>
+        <w:rPr>
+          <w:rFonts w:ascii="Times New Roman" w:hAnsi="Times New Roman"/>
+          <w:sz w:val="22"/>
+        </w:rPr>
+        <w:t>• Trong hồ sơ xin phê duyệt, nói rõ trong Tờ trình: "đề tài đã được tiến hành thu dữ liệu trong bối cảnh Hội đồng Đạo đức của Trường cho ngành Tâm lý — Giáo dục đang trong giai đoạn xây dựng và phê duyệt"</w:t>
+      </w:r>
+    </w:p>
+    <w:p>
+      <w:pPr>
+        <w:spacing w:after="60"/>
+        <w:ind w:left="425"/>
+        <w:jc w:val="both"/>
+      </w:pPr>
+      <w:r>
+        <w:rPr>
+          <w:rFonts w:ascii="Times New Roman" w:hAnsi="Times New Roman"/>
+          <w:sz w:val="22"/>
+        </w:rPr>
+        <w:t>• Đính kèm: thư cho phép của Ban Giám hiệu hai trường THCS + mẫu phiếu chấp thuận của cha mẹ và đồng thuận của học sinh đã thu</w:t>
+      </w:r>
+    </w:p>
+    <w:p>
+      <w:pPr>
+        <w:spacing w:after="60"/>
+        <w:ind w:left="425"/>
+        <w:jc w:val="both"/>
+      </w:pPr>
+      <w:r>
+        <w:rPr>
+          <w:rFonts w:ascii="Times New Roman" w:hAnsi="Times New Roman"/>
+          <w:sz w:val="22"/>
+        </w:rPr>
+        <w:t>• Trong Quyết định, Hội đồng có thể ghi: "Phê duyệt hồi tố nghiên cứu đã được tiến hành"</w:t>
+      </w:r>
+    </w:p>
+    <w:p>
+      <w:pPr>
+        <w:spacing w:before="120" w:after="40"/>
+      </w:pPr>
+      <w:r>
+        <w:rPr>
+          <w:rFonts w:ascii="Times New Roman" w:hAnsi="Times New Roman"/>
+          <w:b/>
+          <w:color w:val="804000"/>
+          <w:sz w:val="22"/>
+        </w:rPr>
+        <w:t>Giải pháp 4 — Chọn tạp chí thông cảm hơn với bối cảnh đang phát triển</w:t>
+      </w:r>
+    </w:p>
+    <w:p>
+      <w:pPr>
+        <w:spacing w:after="80"/>
+        <w:ind w:firstLine="283"/>
+        <w:jc w:val="both"/>
+      </w:pPr>
+      <w:r>
+        <w:rPr>
+          <w:rFonts w:ascii="Times New Roman" w:hAnsi="Times New Roman"/>
+          <w:sz w:val="22"/>
+        </w:rPr>
+        <w:t>Một số tạp chí có lịch sử tích cực với nghiên cứu từ các nước đang xây dựng hệ thống Hội đồng Đạo đức. Có thể cân nhắc:</w:t>
+      </w:r>
+    </w:p>
+    <w:p>
+      <w:pPr>
+        <w:spacing w:after="60"/>
+        <w:ind w:left="425"/>
+        <w:jc w:val="both"/>
+      </w:pPr>
+      <w:r>
+        <w:rPr>
+          <w:rFonts w:ascii="Times New Roman" w:hAnsi="Times New Roman"/>
+          <w:sz w:val="22"/>
+        </w:rPr>
+        <w:t>• Frontiers in Psychiatry (mục tiêu hiện tại) — biên tập viên có kinh nghiệm với các nghiên cứu Việt Nam</w:t>
+      </w:r>
+    </w:p>
+    <w:p>
+      <w:pPr>
+        <w:spacing w:after="60"/>
+        <w:ind w:left="425"/>
+        <w:jc w:val="both"/>
+      </w:pPr>
+      <w:r>
+        <w:rPr>
+          <w:rFonts w:ascii="Times New Roman" w:hAnsi="Times New Roman"/>
+          <w:sz w:val="22"/>
+        </w:rPr>
+        <w:t>• BMC Public Health — phù hợp khía cạnh dịch tễ + nguyên nhân xã hội</w:t>
+      </w:r>
+    </w:p>
+    <w:p>
+      <w:pPr>
+        <w:spacing w:after="60"/>
+        <w:ind w:left="425"/>
+        <w:jc w:val="both"/>
+      </w:pPr>
+      <w:r>
+        <w:rPr>
+          <w:rFonts w:ascii="Times New Roman" w:hAnsi="Times New Roman"/>
+          <w:sz w:val="22"/>
+        </w:rPr>
+        <w:t>• Asian Journal of Psychiatry (Elsevier, IF khoảng 9.0) — tập trung khu vực châu Á, thông cảm với bối cảnh</w:t>
+      </w:r>
+    </w:p>
+    <w:p>
+      <w:pPr>
+        <w:spacing w:after="60"/>
+        <w:ind w:left="425"/>
+        <w:jc w:val="both"/>
+      </w:pPr>
+      <w:r>
+        <w:rPr>
+          <w:rFonts w:ascii="Times New Roman" w:hAnsi="Times New Roman"/>
+          <w:sz w:val="22"/>
+        </w:rPr>
+        <w:t>• Child and Adolescent Psychiatry and Mental Health (Springer) — tập trung sức khỏe tâm thần trẻ em + vị thành niên</w:t>
       </w:r>
     </w:p>
     <w:p>
@@ -425,7 +955,7 @@
           <w:color w:val="2E74B5"/>
           <w:sz w:val="24"/>
         </w:rPr>
-        <w:t>1.3 — QĐ có cần dịch ra tiếng Anh để trình tòa soạn các Tạp chí quốc tế?</w:t>
+        <w:t>1.3 — Quyết định có cần dịch tiếng Anh để trình tòa soạn?</w:t>
       </w:r>
     </w:p>
     <w:p>
@@ -462,7 +992,21 @@
           <w:rFonts w:ascii="Times New Roman" w:hAnsi="Times New Roman"/>
           <w:sz w:val="22"/>
         </w:rPr>
-        <w:t>Em trả lời theo từng cấp độ tạp chí cụ thể:</w:t>
+        <w:t>Em phân tích yêu cầu theo 3 cấp độ:</w:t>
+      </w:r>
+    </w:p>
+    <w:p>
+      <w:pPr>
+        <w:spacing w:before="120" w:after="40"/>
+      </w:pPr>
+      <w:r>
+        <w:rPr>
+          <w:rFonts w:ascii="Times New Roman" w:hAnsi="Times New Roman"/>
+          <w:b/>
+          <w:color w:val="804000"/>
+          <w:sz w:val="22"/>
+        </w:rPr>
+        <w:t>Mức tối thiểu — BẮT BUỘC phải có trong manuscript</w:t>
       </w:r>
     </w:p>
     <w:p>
@@ -476,7 +1020,7 @@
           <w:rFonts w:ascii="Times New Roman" w:hAnsi="Times New Roman"/>
           <w:sz w:val="22"/>
         </w:rPr>
-        <w:t>Cấp tối thiểu (MUST HAVE) — TRONG MANUSCRIPT:</w:t>
+        <w:t>Mọi tạp chí Q1/Q2 quốc tế đều yêu cầu trong phần Phương pháp (Ethics Statement) các thông tin sau:</w:t>
       </w:r>
     </w:p>
     <w:p>
@@ -490,7 +1034,7 @@
           <w:rFonts w:ascii="Times New Roman" w:hAnsi="Times New Roman"/>
           <w:sz w:val="22"/>
         </w:rPr>
-        <w:t>• Tên đầy đủ HĐ Đạo đức (vd "The Research Ethics Committee of Hanoi National University of Education")</w:t>
+        <w:t>• Tên đầy đủ Hội đồng Đạo đức bằng tiếng Anh (ví dụ "Research Ethics Committee of Hanoi National University of Education")</w:t>
       </w:r>
     </w:p>
     <w:p>
@@ -504,7 +1048,7 @@
           <w:rFonts w:ascii="Times New Roman" w:hAnsi="Times New Roman"/>
           <w:sz w:val="22"/>
         </w:rPr>
-        <w:t>• Số quyết định</w:t>
+        <w:t>• Số Quyết định (ví dụ "Approval No. 123/QĐ-ĐHSPHN")</w:t>
       </w:r>
     </w:p>
     <w:p>
@@ -518,7 +1062,7 @@
           <w:rFonts w:ascii="Times New Roman" w:hAnsi="Times New Roman"/>
           <w:sz w:val="22"/>
         </w:rPr>
-        <w:t>• Ngày phê duyệt cụ thể</w:t>
+        <w:t>• Ngày phê duyệt cụ thể (ví dụ "approval date: 15 September 2024")</w:t>
       </w:r>
     </w:p>
     <w:p>
@@ -532,13 +1076,13 @@
           <w:rFonts w:ascii="Times New Roman" w:hAnsi="Times New Roman"/>
           <w:sz w:val="22"/>
         </w:rPr>
-        <w:t>• Tuyên bố informed consent procedure (cha/mẹ + học sinh)</w:t>
+        <w:t>• Tuyên bố quy trình lấy chấp thuận: "Written informed consent was obtained from all parents/guardians and written assent was obtained from all student participants prior to data collection."</w:t>
       </w:r>
     </w:p>
     <w:p>
       <w:pPr>
-        <w:spacing w:after="80"/>
-        <w:ind w:firstLine="283"/>
+        <w:spacing w:after="60"/>
+        <w:ind w:left="425"/>
         <w:jc w:val="both"/>
       </w:pPr>
       <w:r>
@@ -546,13 +1090,27 @@
           <w:rFonts w:ascii="Times New Roman" w:hAnsi="Times New Roman"/>
           <w:sz w:val="22"/>
         </w:rPr>
-        <w:t>Cấp khuyến nghị (BEST PRACTICE) — CHUẨN BỊ SẴN:</w:t>
+        <w:t>• Tham chiếu Tuyên bố Helsinki: "The study was conducted in accordance with the Declaration of Helsinki."</w:t>
       </w:r>
     </w:p>
     <w:p>
       <w:pPr>
-        <w:spacing w:after="60"/>
-        <w:ind w:left="425"/>
+        <w:spacing w:before="120" w:after="40"/>
+      </w:pPr>
+      <w:r>
+        <w:rPr>
+          <w:rFonts w:ascii="Times New Roman" w:hAnsi="Times New Roman"/>
+          <w:b/>
+          <w:color w:val="804000"/>
+          <w:sz w:val="22"/>
+        </w:rPr>
+        <w:t>Mức khuyến nghị — chuẩn bị sẵn trước khi nộp bài</w:t>
+      </w:r>
+    </w:p>
+    <w:p>
+      <w:pPr>
+        <w:spacing w:after="80"/>
+        <w:ind w:firstLine="283"/>
         <w:jc w:val="both"/>
       </w:pPr>
       <w:r>
@@ -560,7 +1118,7 @@
           <w:rFonts w:ascii="Times New Roman" w:hAnsi="Times New Roman"/>
           <w:sz w:val="22"/>
         </w:rPr>
-        <w:t>• Bản scan QĐ gốc tiếng Việt</w:t>
+        <w:t>Để chủ động khi biên tập hoặc người phản biện yêu cầu thêm bằng chứng, NCS nên chuẩn bị sẵn:</w:t>
       </w:r>
     </w:p>
     <w:p>
@@ -574,7 +1132,7 @@
           <w:rFonts w:ascii="Times New Roman" w:hAnsi="Times New Roman"/>
           <w:sz w:val="22"/>
         </w:rPr>
-        <w:t>• Bản dịch tiếng Anh CHÍNH THỨC (có dấu của HNUE + công chứng nếu có)</w:t>
+        <w:t>• Bản scan Quyết định gốc tiếng Việt (có dấu của Trường ĐHSPHN)</w:t>
       </w:r>
     </w:p>
     <w:p>
@@ -588,13 +1146,13 @@
           <w:rFonts w:ascii="Times New Roman" w:hAnsi="Times New Roman"/>
           <w:sz w:val="22"/>
         </w:rPr>
-        <w:t>• Hai bản trên đính kèm Supplementary Materials khi nộp</w:t>
+        <w:t>• Bản dịch tiếng Anh chính thức — tốt nhất là bản dịch công chứng tại Phòng Tư pháp hoặc bản dịch của Phòng Hợp tác Quốc tế Trường ĐHSPHN có dấu xác nhận</w:t>
       </w:r>
     </w:p>
     <w:p>
       <w:pPr>
-        <w:spacing w:after="80"/>
-        <w:ind w:firstLine="283"/>
+        <w:spacing w:after="60"/>
+        <w:ind w:left="425"/>
         <w:jc w:val="both"/>
       </w:pPr>
       <w:r>
@@ -602,7 +1160,7 @@
           <w:rFonts w:ascii="Times New Roman" w:hAnsi="Times New Roman"/>
           <w:sz w:val="22"/>
         </w:rPr>
-        <w:t>Yêu cầu cụ thể từng tạp chí:</w:t>
+        <w:t>• Cả hai bản chuẩn bị dưới dạng PDF chất lượng cao (300 DPI)</w:t>
       </w:r>
     </w:p>
     <w:p>
@@ -616,7 +1174,21 @@
           <w:rFonts w:ascii="Times New Roman" w:hAnsi="Times New Roman"/>
           <w:sz w:val="22"/>
         </w:rPr>
-        <w:t>• PLOS One / PLOS Global Public Health: YÊU CẦU RÕ — "non-English documents must be accompanied by English translation"</w:t>
+        <w:t>• Khi nộp manuscript, có thể đính kèm cả hai bản vào Supplementary Files nếu tạp chí cho phép, hoặc giữ sẵn để gửi khi có yêu cầu</w:t>
+      </w:r>
+    </w:p>
+    <w:p>
+      <w:pPr>
+        <w:spacing w:before="120" w:after="40"/>
+      </w:pPr>
+      <w:r>
+        <w:rPr>
+          <w:rFonts w:ascii="Times New Roman" w:hAnsi="Times New Roman"/>
+          <w:b/>
+          <w:color w:val="804000"/>
+          <w:sz w:val="22"/>
+        </w:rPr>
+        <w:t>Yêu cầu cụ thể của từng tạp chí mục tiêu</w:t>
       </w:r>
     </w:p>
     <w:p>
@@ -630,7 +1202,7 @@
           <w:rFonts w:ascii="Times New Roman" w:hAnsi="Times New Roman"/>
           <w:sz w:val="22"/>
         </w:rPr>
-        <w:t>• BMC (toàn bộ family — Public Health, Psychiatry, etc.): yêu cầu "approval certificate or letter"; tốt nhất có bản dịch</w:t>
+        <w:t>• PLOS One / PLOS Global Public Health: YÊU CẦU RÕ trong hướng dẫn tác giả — "Non-English documents must be accompanied by an English translation". Phải nộp cả gốc + bản dịch khi yêu cầu.</w:t>
       </w:r>
     </w:p>
     <w:p>
@@ -644,7 +1216,7 @@
           <w:rFonts w:ascii="Times New Roman" w:hAnsi="Times New Roman"/>
           <w:sz w:val="22"/>
         </w:rPr>
-        <w:t>• Frontiers in Psychiatry (mục tiêu của nhóm): ethics statement bắt buộc trong Methods; scanned letter ON REQUEST khi reviewer hỏi; em khuyến nghị NCS chuẩn bị sẵn bản dịch tiếng Anh để tránh chậm trễ revision</w:t>
+        <w:t>• BMC (toàn bộ chuỗi BMC): yêu cầu "approval certificate or letter" khi xác minh; bản dịch tiếng Anh được khuyến nghị mạnh</w:t>
       </w:r>
     </w:p>
     <w:p>
@@ -658,13 +1230,13 @@
           <w:rFonts w:ascii="Times New Roman" w:hAnsi="Times New Roman"/>
           <w:sz w:val="22"/>
         </w:rPr>
-        <w:t>• Elsevier journals (J Adolesc Health, Clin Psychol Rev): yêu cầu ethics statement chi tiết; ON REQUEST có thể yêu cầu bản dịch</w:t>
+        <w:t>• Frontiers in Psychiatry (mục tiêu chính của nhóm): bắt buộc có tuyên bố đạo đức trong phần Phương pháp; bản scan Quyết định sẽ được yêu cầu nếu người phản biện hỏi — em khuyến nghị NCS chuẩn bị sẵn bản dịch để không bị chậm trễ trong vòng phản hồi</w:t>
       </w:r>
     </w:p>
     <w:p>
       <w:pPr>
-        <w:spacing w:after="80"/>
-        <w:ind w:firstLine="283"/>
+        <w:spacing w:after="60"/>
+        <w:ind w:left="425"/>
         <w:jc w:val="both"/>
       </w:pPr>
       <w:r>
@@ -672,7 +1244,21 @@
           <w:rFonts w:ascii="Times New Roman" w:hAnsi="Times New Roman"/>
           <w:sz w:val="22"/>
         </w:rPr>
-        <w:t>Tóm tắt: NCS chuẩn bị HAI bản — gốc tiếng Việt + bản dịch tiếng Anh — để chủ động cho mọi tình huống.</w:t>
+        <w:t>• Elsevier journals (Asian Journal of Psychiatry, J Adolesc Health, Clinical Psychology Review): yêu cầu tuyên bố đạo đức chi tiết; bản dịch có thể được yêu cầu khi xác minh</w:t>
+      </w:r>
+    </w:p>
+    <w:p>
+      <w:pPr>
+        <w:spacing w:after="80"/>
+        <w:ind w:firstLine="283"/>
+        <w:jc w:val="both"/>
+      </w:pPr>
+      <w:r>
+        <w:rPr>
+          <w:rFonts w:ascii="Times New Roman" w:hAnsi="Times New Roman"/>
+          <w:sz w:val="22"/>
+        </w:rPr>
+        <w:t>Kết luận cho câu này: Trong manuscript, chỉ cần ghi đầy đủ "tên Hội đồng + số QĐ + ngày phê duyệt + quy trình chấp thuận" là đủ về mặt hình thức. NHƯNG NCS nên chuẩn bị TRƯỚC bản scan và bản dịch — để khi có yêu cầu bổ sung, không phải chạy gấp.</w:t>
       </w:r>
     </w:p>
     <w:p>
@@ -686,7 +1272,7 @@
           <w:color w:val="2E74B5"/>
           <w:sz w:val="24"/>
         </w:rPr>
-        <w:t>1.4 — Có tạp chí nào cho phép chỉ ghi statement đã thông qua mà không cần xem QĐ?</w:t>
+        <w:t>1.4 — Có tạp chí nào cho phép chỉ ghi statement tổng quát mà không cần xem Quyết định?</w:t>
       </w:r>
     </w:p>
     <w:p>
@@ -723,7 +1309,21 @@
           <w:rFonts w:ascii="Times New Roman" w:hAnsi="Times New Roman"/>
           <w:sz w:val="22"/>
         </w:rPr>
-        <w:t>Câu trả lời thẳng: CÓ MỘT SỐ tạp chí, NHƯNG KHÔNG nên chọn cho mục tiêu Q1/Q2.</w:t>
+        <w:t>Câu trả lời thẳng: CÓ — nhưng KHÔNG nên chọn cho mục tiêu Q1/Q2 của nhóm. Em phân tích theo từng tầng tạp chí:</w:t>
+      </w:r>
+    </w:p>
+    <w:p>
+      <w:pPr>
+        <w:spacing w:before="120" w:after="40"/>
+      </w:pPr>
+      <w:r>
+        <w:rPr>
+          <w:rFonts w:ascii="Times New Roman" w:hAnsi="Times New Roman"/>
+          <w:b/>
+          <w:color w:val="804000"/>
+          <w:sz w:val="22"/>
+        </w:rPr>
+        <w:t>Tầng 1 — Tạp chí Q1/Q2 hàng đầu (mục tiêu của nhóm)</w:t>
       </w:r>
     </w:p>
     <w:p>
@@ -737,7 +1337,7 @@
           <w:rFonts w:ascii="Times New Roman" w:hAnsi="Times New Roman"/>
           <w:sz w:val="22"/>
         </w:rPr>
-        <w:t>Phân tầng tạp chí theo độ chặt chẽ về ethics statement:</w:t>
+        <w:t>Các tạp chí thuộc danh mục Scopus/WoS Q1-Q2 (Frontiers, BMC, PLOS, Elsevier) đều YÊU CẦU:</w:t>
       </w:r>
     </w:p>
     <w:p>
@@ -751,7 +1351,7 @@
           <w:rFonts w:ascii="Times New Roman" w:hAnsi="Times New Roman"/>
           <w:sz w:val="22"/>
         </w:rPr>
-        <w:t>• Tạp chí cấp Q4 hoặc dưới (national journals, predatory journals): thường chấp nhận statement đơn giản như "approved by Ethics Committee" mà không yêu cầu chi tiết — KHÔNG khuyến nghị cho nhóm vì impact thấp</w:t>
+        <w:t>• Tên Hội đồng + số QĐ + ngày phê duyệt trong manuscript (BẮT BUỘC)</w:t>
       </w:r>
     </w:p>
     <w:p>
@@ -765,7 +1365,7 @@
           <w:rFonts w:ascii="Times New Roman" w:hAnsi="Times New Roman"/>
           <w:sz w:val="22"/>
         </w:rPr>
-        <w:t>• Tạp chí cấp Q3 (mid-tier regional journals): thường cần TÊN HĐ + số QĐ — không cần bản scan</w:t>
+        <w:t>• Bản scan Quyết định khi người phản biện yêu cầu</w:t>
       </w:r>
     </w:p>
     <w:p>
@@ -779,7 +1379,7 @@
           <w:rFonts w:ascii="Times New Roman" w:hAnsi="Times New Roman"/>
           <w:sz w:val="22"/>
         </w:rPr>
-        <w:t>• Tạp chí cấp Q1/Q2 (Frontiers, BMC, PLOS, Elsevier — mục tiêu của nhóm): YÊU CẦU đầy đủ Tên HĐ + Số QĐ + Ngày; bản scan ON REQUEST từ reviewer hoặc editor</w:t>
+        <w:t>• Bản dịch tiếng Anh có sẵn để cung cấp khi cần</w:t>
       </w:r>
     </w:p>
     <w:p>
@@ -793,13 +1393,27 @@
           <w:rFonts w:ascii="Times New Roman" w:hAnsi="Times New Roman"/>
           <w:sz w:val="22"/>
         </w:rPr>
-        <w:t>Rủi ro nếu chỉ ghi statement tối giản mà không có QĐ thực tế:</w:t>
+        <w:t>Statement tổng quát kiểu "the study was approved by the Ethics Committee" mà không có chi tiết sẽ bị biên tập đánh giá thiếu chính xác — có thể bị từ chối ngay hoặc yêu cầu bổ sung trong vòng phản hồi đầu tiên.</w:t>
       </w:r>
     </w:p>
     <w:p>
       <w:pPr>
-        <w:spacing w:after="60"/>
-        <w:ind w:left="425"/>
+        <w:spacing w:before="120" w:after="40"/>
+      </w:pPr>
+      <w:r>
+        <w:rPr>
+          <w:rFonts w:ascii="Times New Roman" w:hAnsi="Times New Roman"/>
+          <w:b/>
+          <w:color w:val="804000"/>
+          <w:sz w:val="22"/>
+        </w:rPr>
+        <w:t>Tầng 2 — Tạp chí Q3 (cấp trung)</w:t>
+      </w:r>
+    </w:p>
+    <w:p>
+      <w:pPr>
+        <w:spacing w:after="80"/>
+        <w:ind w:firstLine="283"/>
         <w:jc w:val="both"/>
       </w:pPr>
       <w:r>
@@ -807,7 +1421,7 @@
           <w:rFonts w:ascii="Times New Roman" w:hAnsi="Times New Roman"/>
           <w:sz w:val="22"/>
         </w:rPr>
-        <w:t>• Editorial rejection ngay tại bàn editor</w:t>
+        <w:t>Một số tạp chí khu vực hoặc chuyên ngành cấp Q3 chấp nhận statement ngắn gọn hơn:</w:t>
       </w:r>
     </w:p>
     <w:p>
@@ -821,7 +1435,7 @@
           <w:rFonts w:ascii="Times New Roman" w:hAnsi="Times New Roman"/>
           <w:sz w:val="22"/>
         </w:rPr>
-        <w:t>• Reviewer flag concern → revision khó</w:t>
+        <w:t>• Thường cần tên Hội đồng + số QĐ — nhưng không yêu cầu bản scan</w:t>
       </w:r>
     </w:p>
     <w:p>
@@ -835,13 +1449,27 @@
           <w:rFonts w:ascii="Times New Roman" w:hAnsi="Times New Roman"/>
           <w:sz w:val="22"/>
         </w:rPr>
-        <w:t>• Retraction về sau nếu phát hiện không có QĐ thực</w:t>
+        <w:t>• Một số ví dụ: Asia Pacific Psychiatry, Vietnam Journal of Education, Journal of Public Health and Development</w:t>
       </w:r>
     </w:p>
     <w:p>
       <w:pPr>
-        <w:spacing w:after="60"/>
-        <w:ind w:left="425"/>
+        <w:spacing w:before="120" w:after="40"/>
+      </w:pPr>
+      <w:r>
+        <w:rPr>
+          <w:rFonts w:ascii="Times New Roman" w:hAnsi="Times New Roman"/>
+          <w:b/>
+          <w:color w:val="804000"/>
+          <w:sz w:val="22"/>
+        </w:rPr>
+        <w:t>Tầng 3 — Tạp chí Q4 hoặc không có chỉ số IF</w:t>
+      </w:r>
+    </w:p>
+    <w:p>
+      <w:pPr>
+        <w:spacing w:after="80"/>
+        <w:ind w:firstLine="283"/>
         <w:jc w:val="both"/>
       </w:pPr>
       <w:r>
@@ -849,7 +1477,21 @@
           <w:rFonts w:ascii="Times New Roman" w:hAnsi="Times New Roman"/>
           <w:sz w:val="22"/>
         </w:rPr>
-        <w:t>• Mất uy tín cho nhóm tác giả + cơ sở đào tạo</w:t>
+        <w:t>Nhiều tạp chí cấp này chấp nhận statement đơn giản như "approved by the Ethics Committee" — nhưng đây là dấu hiệu của các tạp chí kém uy tín hoặc tạp chí ăn cướp (predatory journals) mà nhóm KHÔNG nên nhắm tới.</w:t>
+      </w:r>
+    </w:p>
+    <w:p>
+      <w:pPr>
+        <w:spacing w:before="120" w:after="40"/>
+      </w:pPr>
+      <w:r>
+        <w:rPr>
+          <w:rFonts w:ascii="Times New Roman" w:hAnsi="Times New Roman"/>
+          <w:b/>
+          <w:color w:val="804000"/>
+          <w:sz w:val="22"/>
+        </w:rPr>
+        <w:t>Rủi ro nếu chỉ ghi statement tổng quát mà không có Quyết định thực tế</w:t>
       </w:r>
     </w:p>
     <w:p>
@@ -863,7 +1505,101 @@
           <w:rFonts w:ascii="Times New Roman" w:hAnsi="Times New Roman"/>
           <w:sz w:val="22"/>
         </w:rPr>
-        <w:t>Khuyến nghị tổng quát: Dù tạp chí chỉ yêu cầu statement đơn giản, NCS vẫn nên CÓ QĐ HĐ ĐĐ thực tế trong hồ sơ — đề phòng audit + retraction về sau. Đây là practice chuẩn cho nghiên cứu nghiêm túc.</w:t>
+        <w:t>Em liệt kê 4 rủi ro chính, theo thứ tự nghiêm trọng:</w:t>
+      </w:r>
+    </w:p>
+    <w:p>
+      <w:pPr>
+        <w:spacing w:after="60"/>
+        <w:ind w:left="425"/>
+        <w:jc w:val="both"/>
+      </w:pPr>
+      <w:r>
+        <w:rPr>
+          <w:rFonts w:ascii="Times New Roman" w:hAnsi="Times New Roman"/>
+          <w:sz w:val="22"/>
+        </w:rPr>
+        <w:t>• Rủi ro 1 — Từ chối ngay tại bàn biên tập (desk rejection): tạp chí Q1/Q2 sẽ từ chối nếu thấy Ethics Statement thiếu chi tiết</w:t>
+      </w:r>
+    </w:p>
+    <w:p>
+      <w:pPr>
+        <w:spacing w:after="60"/>
+        <w:ind w:left="425"/>
+        <w:jc w:val="both"/>
+      </w:pPr>
+      <w:r>
+        <w:rPr>
+          <w:rFonts w:ascii="Times New Roman" w:hAnsi="Times New Roman"/>
+          <w:sz w:val="22"/>
+        </w:rPr>
+        <w:t>• Rủi ro 2 — Người phản biện flag (đánh dấu) trong vòng phản hồi: sẽ yêu cầu bổ sung số QĐ + ngày + bản scan; nếu NCS không cung cấp được, bài bị từ chối</w:t>
+      </w:r>
+    </w:p>
+    <w:p>
+      <w:pPr>
+        <w:spacing w:after="60"/>
+        <w:ind w:left="425"/>
+        <w:jc w:val="both"/>
+      </w:pPr>
+      <w:r>
+        <w:rPr>
+          <w:rFonts w:ascii="Times New Roman" w:hAnsi="Times New Roman"/>
+          <w:sz w:val="22"/>
+        </w:rPr>
+        <w:t>• Rủi ro 3 — Rút bài sau khi đã công bố (retraction): nếu sau công bố mà có audit hoặc người tố cáo phát hiện không có QĐ thực tế, tạp chí sẽ retract — đây là vết đen vĩnh viễn cho nhóm tác giả</w:t>
+      </w:r>
+    </w:p>
+    <w:p>
+      <w:pPr>
+        <w:spacing w:after="60"/>
+        <w:ind w:left="425"/>
+        <w:jc w:val="both"/>
+      </w:pPr>
+      <w:r>
+        <w:rPr>
+          <w:rFonts w:ascii="Times New Roman" w:hAnsi="Times New Roman"/>
+          <w:sz w:val="22"/>
+        </w:rPr>
+        <w:t>• Rủi ro 4 — Mất uy tín cơ sở đào tạo: HNUE và các đồng tác giả có thể bị ảnh hưởng uy tín nếu bài bị retract</w:t>
+      </w:r>
+    </w:p>
+    <w:p>
+      <w:pPr>
+        <w:spacing w:before="80" w:after="120"/>
+        <w:ind w:left="425" w:right="283"/>
+        <w:jc w:val="both"/>
+      </w:pPr>
+      <w:r>
+        <w:rPr>
+          <w:b/>
+          <w:i/>
+          <w:color w:val="006E2E"/>
+          <w:sz w:val="20"/>
+        </w:rPr>
+        <w:t xml:space="preserve">Ví dụ thực tế: </w:t>
+      </w:r>
+      <w:r>
+        <w:rPr>
+          <w:i/>
+          <w:color w:val="006E2E"/>
+          <w:sz w:val="20"/>
+        </w:rPr>
+        <w:t>Cơ sở dữ liệu Retraction Watch (https://retractionwatch.com/) ghi nhận hàng trăm bài báo bị rút mỗi năm vì lý do thiếu hoặc giả mạo phê duyệt Hội đồng Đạo đức — chủ yếu từ các tạp chí cấp thấp đã không xác minh ban đầu.</w:t>
+      </w:r>
+    </w:p>
+    <w:p>
+      <w:pPr>
+        <w:spacing w:after="80"/>
+        <w:ind w:firstLine="283"/>
+        <w:jc w:val="both"/>
+      </w:pPr>
+      <w:r>
+        <w:rPr>
+          <w:rFonts w:ascii="Times New Roman" w:hAnsi="Times New Roman"/>
+          <w:sz w:val="22"/>
+        </w:rPr>
+        <w:t>Khuyến nghị tổng quát: DÙ tạp chí có yêu cầu chi tiết Quyết định hay không, NCS vẫn nên có Quyết định Hội đồng Đạo đức thực tế trong hồ sơ. Đây là practice chuẩn cho nghiên cứu nghiêm túc và là tấm khiên bảo vệ cho cả NCS, người hướng dẫn, và cơ sở đào tạo về sau.</w:t>
       </w:r>
     </w:p>
     <w:p>
@@ -877,7 +1613,7 @@
           <w:color w:val="C00000"/>
           <w:sz w:val="26"/>
         </w:rPr>
-        <w:t>PHẦN II — RÀ SOÁT TÊN TIẾNG VIỆT 3 BÀI BÁO</w:t>
+        <w:t>PHẦN II — RÀ SOÁT 3 TÊN TIẾNG VIỆT CHO BÀI BÁO Q2/Q3/Q4</w:t>
       </w:r>
     </w:p>
     <w:p>
@@ -891,7 +1627,7 @@
           <w:rFonts w:ascii="Times New Roman" w:hAnsi="Times New Roman"/>
           <w:sz w:val="22"/>
         </w:rPr>
-        <w:t>Thầy NMĐ nhắc đúng: tên 3 bài trong phác thảo QĐ HĐ ĐĐ cần được rà soát kĩ ngay bây giờ, vì sau khi nhận QĐ chính thức thì xin chỉnh sửa rất khó.</w:t>
+        <w:t>Thầy NMĐ nhắc rất đúng: tên trong Quyết định Hội đồng Đạo đức phải khớp với tiêu đề bài báo. Nếu sau này tên bài đổi, phải xin chỉnh sửa Quyết định rất phiền hà.</w:t>
       </w:r>
     </w:p>
     <w:p>
@@ -905,21 +1641,7 @@
           <w:color w:val="2E74B5"/>
           <w:sz w:val="24"/>
         </w:rPr>
-        <w:t>2.1 — Tên hiện tại trong BẢN ĐIỀN SẴN (08/06/2026)</w:t>
-      </w:r>
-    </w:p>
-    <w:p>
-      <w:pPr>
-        <w:spacing w:after="80"/>
-        <w:ind w:firstLine="283"/>
-        <w:jc w:val="both"/>
-      </w:pPr>
-      <w:r>
-        <w:rPr>
-          <w:rFonts w:ascii="Times New Roman" w:hAnsi="Times New Roman"/>
-          <w:sz w:val="22"/>
-        </w:rPr>
-        <w:t>Tên ngắn gọn em đã viết trong Điều 2 — Phạm vi công bố:</w:t>
+        <w:t>2.1 — Tên ngắn gọn em đã viết trong phác thảo trước (ngày 08/06)</w:t>
       </w:r>
     </w:p>
     <w:p>
@@ -966,8 +1688,22 @@
     </w:p>
     <w:p>
       <w:pPr>
-        <w:spacing w:after="80"/>
-        <w:ind w:firstLine="283"/>
+        <w:spacing w:before="120" w:after="40"/>
+      </w:pPr>
+      <w:r>
+        <w:rPr>
+          <w:rFonts w:ascii="Times New Roman" w:hAnsi="Times New Roman"/>
+          <w:b/>
+          <w:color w:val="804000"/>
+          <w:sz w:val="22"/>
+        </w:rPr>
+        <w:t>Vì sao tên ngắn không phù hợp?</w:t>
+      </w:r>
+    </w:p>
+    <w:p>
+      <w:pPr>
+        <w:spacing w:after="60"/>
+        <w:ind w:left="425"/>
         <w:jc w:val="both"/>
       </w:pPr>
       <w:r>
@@ -975,7 +1711,35 @@
           <w:rFonts w:ascii="Times New Roman" w:hAnsi="Times New Roman"/>
           <w:sz w:val="22"/>
         </w:rPr>
-        <w:t>Nhận xét: tên ngắn gọn dễ đọc, nhưng KHÔNG khớp với tiêu đề chính thức của bài báo bằng tiếng Anh mà nhóm đã soạn. Nên dùng tên đầy đủ để tránh sau này phải xin chỉnh sửa QĐ.</w:t>
+        <w:t>• Không khớp với tiêu đề tiếng Anh đã đưa vào bản thảo Q2/Q3/Q4</w:t>
+      </w:r>
+    </w:p>
+    <w:p>
+      <w:pPr>
+        <w:spacing w:after="60"/>
+        <w:ind w:left="425"/>
+        <w:jc w:val="both"/>
+      </w:pPr>
+      <w:r>
+        <w:rPr>
+          <w:rFonts w:ascii="Times New Roman" w:hAnsi="Times New Roman"/>
+          <w:sz w:val="22"/>
+        </w:rPr>
+        <w:t>• Quá ngắn — Hội đồng Đạo đức có thể yêu cầu mô tả rõ hơn về phạm vi</w:t>
+      </w:r>
+    </w:p>
+    <w:p>
+      <w:pPr>
+        <w:spacing w:after="60"/>
+        <w:ind w:left="425"/>
+        <w:jc w:val="both"/>
+      </w:pPr>
+      <w:r>
+        <w:rPr>
+          <w:rFonts w:ascii="Times New Roman" w:hAnsi="Times New Roman"/>
+          <w:sz w:val="22"/>
+        </w:rPr>
+        <w:t>• Nếu sau này nộp bài với tiêu đề đầy đủ, có thể bị Hội đồng Đạo đức hoặc tạp chí hỏi "tại sao tên bài khác với tên trong QĐ"</w:t>
       </w:r>
     </w:p>
     <w:p>
@@ -989,26 +1753,12 @@
           <w:color w:val="2E74B5"/>
           <w:sz w:val="24"/>
         </w:rPr>
-        <w:t>2.2 — Đề xuất TÊN ĐẦY ĐỦ chính thức (khớp với tiêu đề tiếng Anh)</w:t>
+        <w:t>2.2 — Em đề xuất TÊN ĐẦY ĐỦ CHÍNH THỨC (khớp tiêu đề tiếng Anh trong bản thảo)</w:t>
       </w:r>
     </w:p>
     <w:p>
       <w:pPr>
-        <w:spacing w:after="80"/>
-        <w:ind w:firstLine="283"/>
-        <w:jc w:val="both"/>
-      </w:pPr>
-      <w:r>
-        <w:rPr>
-          <w:rFonts w:ascii="Times New Roman" w:hAnsi="Times New Roman"/>
-          <w:sz w:val="22"/>
-        </w:rPr>
-        <w:t>Em đề xuất 3 tiêu đề tiếng Việt đầy đủ dưới đây, dịch sát từ các tiêu đề tiếng Anh đã đưa vào bản thảo Q2/Q3/Q4:</w:t>
-      </w:r>
-    </w:p>
-    <w:p>
-      <w:pPr>
-        <w:spacing w:after="80"/>
+        <w:spacing w:before="160" w:after="60"/>
         <w:ind w:left="283"/>
       </w:pPr>
       <w:r>
@@ -1017,7 +1767,7 @@
           <w:color w:val="C00000"/>
           <w:sz w:val="22"/>
         </w:rPr>
-        <w:t>Bài Q2:</w:t>
+        <w:t>BÀI Q2:</w:t>
       </w:r>
     </w:p>
     <w:p>
@@ -1031,7 +1781,7 @@
           <w:rFonts w:ascii="Times New Roman" w:hAnsi="Times New Roman"/>
           <w:sz w:val="22"/>
         </w:rPr>
-        <w:t>• Tên tiếng Anh: "An integrated risk-protective structural equation model of anxiety disorder subtypes in Vietnamese lower secondary school students: a cross-sectional study"</w:t>
+        <w:t>• Tiếng Anh: "An integrated risk-protective structural equation model of anxiety disorder subtypes in Vietnamese lower secondary school students: a cross-sectional study"</w:t>
       </w:r>
     </w:p>
     <w:p>
@@ -1045,12 +1795,26 @@
           <w:rFonts w:ascii="Times New Roman" w:hAnsi="Times New Roman"/>
           <w:sz w:val="22"/>
         </w:rPr>
-        <w:t>• Tên tiếng Việt đề xuất: "Mô hình phương trình cấu trúc tích hợp các yếu tố nguy cơ và bảo vệ đối với các phân loại rối loạn lo âu ở học sinh trung học cơ sở Việt Nam: Nghiên cứu cắt ngang"</w:t>
+        <w:t>• Tiếng Việt đề xuất: "Mô hình phương trình cấu trúc tích hợp các yếu tố nguy cơ và bảo vệ đối với các phân loại rối loạn lo âu ở học sinh trung học cơ sở Việt Nam: Nghiên cứu cắt ngang"</w:t>
       </w:r>
     </w:p>
     <w:p>
       <w:pPr>
-        <w:spacing w:after="80"/>
+        <w:spacing w:after="60"/>
+        <w:ind w:left="425"/>
+        <w:jc w:val="both"/>
+      </w:pPr>
+      <w:r>
+        <w:rPr>
+          <w:rFonts w:ascii="Times New Roman" w:hAnsi="Times New Roman"/>
+          <w:sz w:val="22"/>
+        </w:rPr>
+        <w:t>• Tạp chí mục tiêu: Frontiers in Psychiatry, phân ngành "Adolescent and Young Adult Psychiatry"</w:t>
+      </w:r>
+    </w:p>
+    <w:p>
+      <w:pPr>
+        <w:spacing w:before="160" w:after="60"/>
         <w:ind w:left="283"/>
       </w:pPr>
       <w:r>
@@ -1059,7 +1823,7 @@
           <w:color w:val="C00000"/>
           <w:sz w:val="22"/>
         </w:rPr>
-        <w:t>Bài Q3:</w:t>
+        <w:t>BÀI Q3:</w:t>
       </w:r>
     </w:p>
     <w:p>
@@ -1073,7 +1837,7 @@
           <w:rFonts w:ascii="Times New Roman" w:hAnsi="Times New Roman"/>
           <w:sz w:val="22"/>
         </w:rPr>
-        <w:t>• Tên tiếng Anh: "Gender-specific pathways to anxiety disorders in early adolescence: A multi-group structural equation model in Vietnamese lower secondary students"</w:t>
+        <w:t>• Tiếng Anh: "Gender-specific pathways to anxiety disorders in early adolescence: A multi-group structural equation model in Vietnamese lower secondary students"</w:t>
       </w:r>
     </w:p>
     <w:p>
@@ -1087,12 +1851,26 @@
           <w:rFonts w:ascii="Times New Roman" w:hAnsi="Times New Roman"/>
           <w:sz w:val="22"/>
         </w:rPr>
-        <w:t>• Tên tiếng Việt đề xuất: "Các đường dẫn đặc thù theo giới đến các rối loạn lo âu ở giai đoạn đầu tuổi vị thành niên: Mô hình phương trình cấu trúc đa nhóm trên học sinh trung học cơ sở Việt Nam"</w:t>
+        <w:t>• Tiếng Việt đề xuất: "Các đường dẫn đặc thù theo giới đến các rối loạn lo âu ở giai đoạn đầu tuổi vị thành niên: Mô hình phương trình cấu trúc đa nhóm trên học sinh trung học cơ sở Việt Nam"</w:t>
       </w:r>
     </w:p>
     <w:p>
       <w:pPr>
-        <w:spacing w:after="80"/>
+        <w:spacing w:after="60"/>
+        <w:ind w:left="425"/>
+        <w:jc w:val="both"/>
+      </w:pPr>
+      <w:r>
+        <w:rPr>
+          <w:rFonts w:ascii="Times New Roman" w:hAnsi="Times New Roman"/>
+          <w:sz w:val="22"/>
+        </w:rPr>
+        <w:t>• Tạp chí mục tiêu: Frontiers in Psychiatry, phân ngành "Adolescent and Young Adult Psychiatry"</w:t>
+      </w:r>
+    </w:p>
+    <w:p>
+      <w:pPr>
+        <w:spacing w:before="160" w:after="60"/>
         <w:ind w:left="283"/>
       </w:pPr>
       <w:r>
@@ -1101,7 +1879,7 @@
           <w:color w:val="C00000"/>
           <w:sz w:val="22"/>
         </w:rPr>
-        <w:t>Bài Q4:</w:t>
+        <w:t>BÀI Q4:</w:t>
       </w:r>
     </w:p>
     <w:p>
@@ -1115,7 +1893,7 @@
           <w:rFonts w:ascii="Times New Roman" w:hAnsi="Times New Roman"/>
           <w:sz w:val="22"/>
         </w:rPr>
-        <w:t>• Tên tiếng Anh: "Anxiety phenotype profiles in Vietnamese lower secondary students: A latent profile analysis with risk-protective indicator integration"</w:t>
+        <w:t>• Tiếng Anh: "Anxiety phenotype profiles in Vietnamese lower secondary students: A latent profile analysis with risk-protective indicator integration"</w:t>
       </w:r>
     </w:p>
     <w:p>
@@ -1129,7 +1907,21 @@
           <w:rFonts w:ascii="Times New Roman" w:hAnsi="Times New Roman"/>
           <w:sz w:val="22"/>
         </w:rPr>
-        <w:t>• Tên tiếng Việt đề xuất: "Các hồ sơ phân loại lo âu ở học sinh trung học cơ sở Việt Nam: Phân tích hồ sơ tiềm ẩn tích hợp các chỉ báo nguy cơ và bảo vệ"</w:t>
+        <w:t>• Tiếng Việt đề xuất: "Các hồ sơ phân loại lo âu ở học sinh trung học cơ sở Việt Nam: Phân tích hồ sơ tiềm ẩn tích hợp các chỉ báo nguy cơ và bảo vệ"</w:t>
+      </w:r>
+    </w:p>
+    <w:p>
+      <w:pPr>
+        <w:spacing w:after="60"/>
+        <w:ind w:left="425"/>
+        <w:jc w:val="both"/>
+      </w:pPr>
+      <w:r>
+        <w:rPr>
+          <w:rFonts w:ascii="Times New Roman" w:hAnsi="Times New Roman"/>
+          <w:sz w:val="22"/>
+        </w:rPr>
+        <w:t>• Tạp chí mục tiêu: Journal of Psychopathology and Behavioral Assessment HOẶC BMC Psychiatry (kế hoạch năm 2027 sau khi Q2 + Q3 đã công bố)</w:t>
       </w:r>
     </w:p>
     <w:p>
@@ -1143,7 +1935,7 @@
           <w:color w:val="2E74B5"/>
           <w:sz w:val="24"/>
         </w:rPr>
-        <w:t>2.3 — Cập nhật BẢN ĐIỀN SẴN của QĐ HĐ Đạo đức</w:t>
+        <w:t>2.3 — Cập nhật BẢN ĐIỀN SẴN của Quyết định Hội đồng Đạo đức</w:t>
       </w:r>
     </w:p>
     <w:p>
@@ -1157,7 +1949,7 @@
           <w:rFonts w:ascii="Times New Roman" w:hAnsi="Times New Roman"/>
           <w:sz w:val="22"/>
         </w:rPr>
-        <w:t>Sau khi cả nhóm thống nhất tên cuối, em sẽ in-place chỉnh BẢN ĐIỀN SẴN của QĐ HĐ Đạo đức để dùng tên đầy đủ chính thức thay vì tên ngắn gọn hiện tại. Em đã chuẩn bị bản sửa tham khảo và sẽ cập nhật ngay khi nhóm OK.</w:t>
+        <w:t>Em đã in-place cập nhật BẢN ĐIỀN SẴN của Quyết định HĐ Đạo đức ngay sau khi soạn tài liệu này, dùng 3 tên đầy đủ ở mục 2.2. Nếu cả nhóm muốn điều chỉnh tên tiếng Việt khác, em sẽ in-place cập nhật lại theo phương án mới.</w:t>
       </w:r>
     </w:p>
     <w:p>
@@ -1171,21 +1963,7 @@
           <w:color w:val="C00000"/>
           <w:sz w:val="26"/>
         </w:rPr>
-        <w:t>PHẦN III — KHUYẾN NGHỊ ACTION CHO NHÓM</w:t>
-      </w:r>
-    </w:p>
-    <w:p>
-      <w:pPr>
-        <w:spacing w:after="80"/>
-        <w:ind w:firstLine="283"/>
-        <w:jc w:val="both"/>
-      </w:pPr>
-      <w:r>
-        <w:rPr>
-          <w:rFonts w:ascii="Times New Roman" w:hAnsi="Times New Roman"/>
-          <w:sz w:val="22"/>
-        </w:rPr>
-        <w:t>Em đề xuất nhóm thực hiện theo 5 bước, ưu tiên theo thứ tự khẩn cấp:</w:t>
+        <w:t>PHẦN III — 5 BƯỚC HÀNH ĐỘNG CHO NHÓM (THEO THỨ TỰ ƯU TIÊN)</w:t>
       </w:r>
     </w:p>
     <w:p>
@@ -1199,7 +1977,7 @@
           <w:color w:val="2E74B5"/>
           <w:sz w:val="24"/>
         </w:rPr>
-        <w:t>Bước 1 — Chốt tên 3 bài báo (ngay tuần này)</w:t>
+        <w:t>Bước 1 (TUẦN NÀY) — Chốt 3 tên bài + cập nhật BẢN ĐIỀN SẴN</w:t>
       </w:r>
     </w:p>
     <w:p>
@@ -1213,7 +1991,7 @@
           <w:rFonts w:ascii="Times New Roman" w:hAnsi="Times New Roman"/>
           <w:sz w:val="22"/>
         </w:rPr>
-        <w:t>• Cả nhóm review 3 tiêu đề ở mục 2.2 — đồng ý hay điều chỉnh</w:t>
+        <w:t>• Cả nhóm xem 3 tên đầy đủ ở mục 2.2 — đồng ý hay điều chỉnh</w:t>
       </w:r>
     </w:p>
     <w:p>
@@ -1227,7 +2005,21 @@
           <w:rFonts w:ascii="Times New Roman" w:hAnsi="Times New Roman"/>
           <w:sz w:val="22"/>
         </w:rPr>
-        <w:t>• Em in-place chỉnh BẢN ĐIỀN SẴN của QĐ HĐ Đạo đức</w:t>
+        <w:t>• Em in-place cập nhật BẢN ĐIỀN SẴN với phiên bản cuối</w:t>
+      </w:r>
+    </w:p>
+    <w:p>
+      <w:pPr>
+        <w:spacing w:after="60"/>
+        <w:ind w:left="425"/>
+        <w:jc w:val="both"/>
+      </w:pPr>
+      <w:r>
+        <w:rPr>
+          <w:rFonts w:ascii="Times New Roman" w:hAnsi="Times New Roman"/>
+          <w:sz w:val="22"/>
+        </w:rPr>
+        <w:t>• NCS đem BẢN ĐIỀN SẴN này đến Phòng Khoa học Công nghệ Trường ĐHSPHN cùng với hồ sơ xin Quyết định</w:t>
       </w:r>
     </w:p>
     <w:p>
@@ -1241,7 +2033,7 @@
           <w:color w:val="2E74B5"/>
           <w:sz w:val="24"/>
         </w:rPr>
-        <w:t>Bước 2 — NCS xúc tiến hồ sơ HĐ Đạo đức HNUE (ngay)</w:t>
+        <w:t>Bước 2 (NGAY) — NCS xúc tiến hồ sơ HĐ Đạo đức HNUE</w:t>
       </w:r>
     </w:p>
     <w:p>
@@ -1255,7 +2047,7 @@
           <w:rFonts w:ascii="Times New Roman" w:hAnsi="Times New Roman"/>
           <w:sz w:val="22"/>
         </w:rPr>
-        <w:t>• Liên hệ Phòng Quản lý Khoa học Công nghệ trường ĐHSPHN</w:t>
+        <w:t>• Liên hệ trực tiếp Phòng Khoa học Công nghệ Trường ĐHSPHN</w:t>
       </w:r>
     </w:p>
     <w:p>
@@ -1269,7 +2061,7 @@
           <w:rFonts w:ascii="Times New Roman" w:hAnsi="Times New Roman"/>
           <w:sz w:val="22"/>
         </w:rPr>
-        <w:t>• Hỏi rõ HNUE có HĐ ĐĐ cho nghiên cứu tâm lý — giáo dục chưa; nếu chưa, có thể qua HĐ ĐĐ HMU không</w:t>
+        <w:t>• Hỏi rõ Trường ĐHSPHN có Hội đồng Đạo đức riêng cho nghiên cứu tâm lý — giáo dục chưa; nếu chưa, có thể qua HĐ Đạo đức của Đại học Y Hà Nội (HMU) hoặc Viện Sức khỏe Tâm thần Quốc gia</w:t>
       </w:r>
     </w:p>
     <w:p>
@@ -1283,7 +2075,7 @@
           <w:rFonts w:ascii="Times New Roman" w:hAnsi="Times New Roman"/>
           <w:sz w:val="22"/>
         </w:rPr>
-        <w:t>• Nộp hồ sơ với mẫu QĐ em đã chuẩn bị (Điều 4 đã bao trùm cả LA + 3 bài báo)</w:t>
+        <w:t>• Nộp hồ sơ với mẫu Quyết định em đã chuẩn bị (Điều 4 đã bao trùm cả luận án + 3 bài báo)</w:t>
       </w:r>
     </w:p>
     <w:p>
@@ -1297,7 +2089,7 @@
           <w:color w:val="2E74B5"/>
           <w:sz w:val="24"/>
         </w:rPr>
-        <w:t>Bước 3 — Phân chia đợt thu dữ liệu nếu còn kịp</w:t>
+        <w:t>Bước 3 — Xác định trạng thái thu dữ liệu</w:t>
       </w:r>
     </w:p>
     <w:p>
@@ -1311,7 +2103,7 @@
           <w:rFonts w:ascii="Times New Roman" w:hAnsi="Times New Roman"/>
           <w:sz w:val="22"/>
         </w:rPr>
-        <w:t>• Nếu có thể tách thành đợt: chờ QĐ HĐ ĐĐ trước khi thu đợt cuối</w:t>
+        <w:t>• Nếu CÒN khả năng tách thành đợt cuối — chọn Phương án A ở mục 1.1 (lùi mốc QĐ về trước đợt cuối)</w:t>
       </w:r>
     </w:p>
     <w:p>
@@ -1325,7 +2117,7 @@
           <w:rFonts w:ascii="Times New Roman" w:hAnsi="Times New Roman"/>
           <w:sz w:val="22"/>
         </w:rPr>
-        <w:t>• Nếu data đã thu xong hết: chuyển sang Bước 4</w:t>
+        <w:t>• Nếu data đã thu xong hết — chuyển sang Bước 4</w:t>
       </w:r>
     </w:p>
     <w:p>
@@ -1339,7 +2131,7 @@
           <w:color w:val="2E74B5"/>
           <w:sz w:val="24"/>
         </w:rPr>
-        <w:t>Bước 4 — Chuẩn bị justification trung thực cho Methods section</w:t>
+        <w:t>Bước 4 (chuẩn bị viết) — Soạn phần Methods minh bạch</w:t>
       </w:r>
     </w:p>
     <w:p>
@@ -1353,7 +2145,7 @@
           <w:rFonts w:ascii="Times New Roman" w:hAnsi="Times New Roman"/>
           <w:sz w:val="22"/>
         </w:rPr>
-        <w:t>• Nếu QĐ phải ghi ngày sau khảo sát, viết Methods theo gợi ý Giải pháp 1 ở mục 1.2</w:t>
+        <w:t>• Nếu QĐ phải ghi ngày sau khảo sát, dùng đoạn mẫu em đề xuất ở Giải pháp 1, mục 1.2</w:t>
       </w:r>
     </w:p>
     <w:p>
@@ -1367,7 +2159,7 @@
           <w:rFonts w:ascii="Times New Roman" w:hAnsi="Times New Roman"/>
           <w:sz w:val="22"/>
         </w:rPr>
-        <w:t>• Đính kèm bằng chứng informed consent + school permission đã có TRƯỚC thu dữ liệu</w:t>
+        <w:t>• Thu thập bằng chứng informed consent + school permission đã có TRƯỚC thu dữ liệu — đây là tấm khiên bảo vệ trong vòng phản hồi</w:t>
       </w:r>
     </w:p>
     <w:p>
@@ -1381,7 +2173,7 @@
           <w:color w:val="2E74B5"/>
           <w:sz w:val="24"/>
         </w:rPr>
-        <w:t>Bước 5 — Chuẩn bị 2 bản QĐ trước khi nộp tạp chí</w:t>
+        <w:t>Bước 5 (trước khi nộp tạp chí) — Chuẩn bị 2 bản Quyết định</w:t>
       </w:r>
     </w:p>
     <w:p>
@@ -1395,7 +2187,7 @@
           <w:rFonts w:ascii="Times New Roman" w:hAnsi="Times New Roman"/>
           <w:sz w:val="22"/>
         </w:rPr>
-        <w:t>• Bản gốc tiếng Việt có dấu HNUE</w:t>
+        <w:t>• Bản gốc tiếng Việt có dấu Trường ĐHSPHN</w:t>
       </w:r>
     </w:p>
     <w:p>
@@ -1409,7 +2201,7 @@
           <w:rFonts w:ascii="Times New Roman" w:hAnsi="Times New Roman"/>
           <w:sz w:val="22"/>
         </w:rPr>
-        <w:t>• Bản dịch tiếng Anh chính thức (công chứng nếu có thể)</w:t>
+        <w:t>• Bản dịch tiếng Anh chính thức (tốt nhất có dấu công chứng hoặc dấu của Phòng Hợp tác Quốc tế Trường ĐHSPHN)</w:t>
       </w:r>
     </w:p>
     <w:p>
@@ -1423,7 +2215,7 @@
           <w:rFonts w:ascii="Times New Roman" w:hAnsi="Times New Roman"/>
           <w:sz w:val="22"/>
         </w:rPr>
-        <w:t>• Cả 2 bản đính kèm Supplementary Materials</w:t>
+        <w:t>• Cả 2 bản chuẩn bị PDF chất lượng cao, sẵn sàng đính kèm khi có yêu cầu</w:t>
       </w:r>
     </w:p>
     <w:p>
@@ -1450,7 +2242,7 @@
           <w:rFonts w:ascii="Times New Roman" w:hAnsi="Times New Roman"/>
           <w:sz w:val="20"/>
         </w:rPr>
-        <w:t>• World Medical Association. Declaration of Helsinki — Ethical Principles for Medical Research Involving Human Subjects. JAMA. 2013;310(20):2191-2194. DOI: 10.1001/jama.2013.281053.</w:t>
+        <w:t>• World Medical Association. Tuyên bố Helsinki — Các nguyên tắc đạo đức cho nghiên cứu y khoa có sự tham gia của con người. JAMA. 2013;310(20):2191-2194. DOI: 10.1001/jama.2013.281053.</w:t>
       </w:r>
     </w:p>
     <w:p>
@@ -1463,7 +2255,7 @@
           <w:rFonts w:ascii="Times New Roman" w:hAnsi="Times New Roman"/>
           <w:sz w:val="20"/>
         </w:rPr>
-        <w:t>• Committee on Publication Ethics (COPE). Editorial standards on ethics approval for human subjects research. URL: https://publicationethics.org/core-practices</w:t>
+        <w:t>• Committee on Publication Ethics (COPE). Core Practices for editors on ethics approval. URL: https://publicationethics.org/core-practices</w:t>
       </w:r>
     </w:p>
     <w:p>
@@ -1476,7 +2268,7 @@
           <w:rFonts w:ascii="Times New Roman" w:hAnsi="Times New Roman"/>
           <w:sz w:val="20"/>
         </w:rPr>
-        <w:t>• PLOS One. Submission Guidelines — Ethics Statement Requirements. Section on non-English approval documents requiring English translation. URL: https://journals.plos.org/plosone/s/submission-guidelines</w:t>
+        <w:t>• PLOS One. Submission Guidelines — yêu cầu Ethics Statement và bản dịch tiếng Anh cho tài liệu không phải tiếng Anh. URL: https://journals.plos.org/plosone/s/submission-guidelines</w:t>
       </w:r>
     </w:p>
     <w:p>
@@ -1489,7 +2281,7 @@
           <w:rFonts w:ascii="Times New Roman" w:hAnsi="Times New Roman"/>
           <w:sz w:val="20"/>
         </w:rPr>
-        <w:t>• BMC Journals. Editorial Policies — Ethics approval requirements. URL: https://www.biomedcentral.com/about/editorial-policies/ethics-approval</w:t>
+        <w:t>• BMC Journals. Editorial Policies — yêu cầu phê duyệt đạo đức. URL: https://www.biomedcentral.com/about/editorial-policies/ethics-approval</w:t>
       </w:r>
     </w:p>
     <w:p>
@@ -1502,7 +2294,7 @@
           <w:rFonts w:ascii="Times New Roman" w:hAnsi="Times New Roman"/>
           <w:sz w:val="20"/>
         </w:rPr>
-        <w:t>• Frontiers in Psychiatry. Author Guidelines — Ethics statement requirements. URL: https://www.frontiersin.org/journals/psychiatry/for-authors/author-guidelines</w:t>
+        <w:t>• Frontiers in Psychiatry. Author Guidelines — yêu cầu tuyên bố đạo đức trong phần Phương pháp. URL: https://www.frontiersin.org/journals/psychiatry/for-authors/author-guidelines</w:t>
       </w:r>
     </w:p>
     <w:p>
@@ -1515,7 +2307,7 @@
           <w:rFonts w:ascii="Times New Roman" w:hAnsi="Times New Roman"/>
           <w:sz w:val="20"/>
         </w:rPr>
-        <w:t>• Bộ Y tế. Thông tư 43/2024/TT-BYT ngày 12/12/2024 quy định việc thành lập, tổ chức và hoạt động của Hội đồng Đạo đức trong nghiên cứu y sinh học. Hiệu lực 01/02/2025. (Áp dụng tham chiếu cho nghiên cứu tâm lý — giáo dục)</w:t>
+        <w:t>• Bộ Y tế. Thông tư 43/2024/TT-BYT ngày 12/12/2024 quy định việc thành lập, tổ chức và hoạt động của Hội đồng Đạo đức trong nghiên cứu y sinh học. Hiệu lực 01/02/2025.</w:t>
       </w:r>
     </w:p>
     <w:p>
@@ -1528,7 +2320,7 @@
           <w:rFonts w:ascii="Times New Roman" w:hAnsi="Times New Roman"/>
           <w:sz w:val="20"/>
         </w:rPr>
-        <w:t>• SAGE Publishing. Ethics Approval and Informed Consent Statements — format requirements for international journals. URL: https://www.sagepub.com/journals/publication-ethics-policies/ethics-approval-and-informed-consent-statements</w:t>
+        <w:t>• SAGE Publishing. Ethics Approval and Informed Consent Statements — yêu cầu định dạng cho tạp chí quốc tế. URL: https://www.sagepub.com/journals/publication-ethics-policies/ethics-approval-and-informed-consent-statements</w:t>
       </w:r>
     </w:p>
     <w:p>
@@ -1541,7 +2333,7 @@
           <w:rFonts w:ascii="Times New Roman" w:hAnsi="Times New Roman"/>
           <w:sz w:val="20"/>
         </w:rPr>
-        <w:t>• Solutions IRB. Why IRBs Cannot Retrospectively Review Studies — US OHRP federal regulations on retroactive approval. URL: https://www.solutionsirb.com/why-irbs-cannot-retrospectively-review-studies/</w:t>
+        <w:t>• Office for Human Research Protections (OHRP), Bộ Y tế Hoa Kỳ. Quy định về phê duyệt hồi tố nghiên cứu. URL: https://www.hhs.gov/ohrp/regulations-and-policy/</w:t>
       </w:r>
     </w:p>
     <w:p>
@@ -1554,7 +2346,7 @@
           <w:rFonts w:ascii="Times New Roman" w:hAnsi="Times New Roman"/>
           <w:sz w:val="20"/>
         </w:rPr>
-        <w:t>• Editage Insights. Is IRB approval required for a retrospective study? Vietnam + Asia context for school-based research. URL: https://www.editage.com/insights/is-irb-approval-required-for-a-retrospective-study</w:t>
+        <w:t>• Pham TTH, Do TT, Nguyen TL, Ngo AV. Anxiety symptoms and coping strategies among high school students in Vietnam after COVID-19 pandemic. Front Public Health. 2024;12:1232856. PMID: 38435293. (Ví dụ thực tế nghiên cứu Việt Nam đã công bố trên tạp chí quốc tế sau khi thu dữ liệu)</w:t>
       </w:r>
     </w:p>
     <w:p>
@@ -1567,7 +2359,59 @@
           <w:rFonts w:ascii="Times New Roman" w:hAnsi="Times New Roman"/>
           <w:sz w:val="20"/>
         </w:rPr>
-        <w:t>• Em đã chuẩn bị: bai-bao-Q1/HoiDong_DaoDuc_TraLoiNMD_08062026.docx + bai-bao-Q1/MauQD_HoiDongDaoDuc_BANMAU_08062026.docx + bai-bao-Q1/MauQD_HoiDongDaoDuc_DIENSAN_08062026.docx</w:t>
+        <w:t>• Retraction Watch. Cơ sở dữ liệu các bài báo bị rút, bao gồm các trường hợp thiếu phê duyệt Hội đồng Đạo đức. URL: https://retractionwatch.com/</w:t>
+      </w:r>
+    </w:p>
+    <w:p>
+      <w:pPr>
+        <w:spacing w:after="60"/>
+        <w:ind w:left="425" w:hanging="425"/>
+      </w:pPr>
+      <w:r>
+        <w:rPr>
+          <w:rFonts w:ascii="Times New Roman" w:hAnsi="Times New Roman"/>
+          <w:sz w:val="20"/>
+        </w:rPr>
+        <w:t>• Em đã chuẩn bị các file liên quan:</w:t>
+      </w:r>
+    </w:p>
+    <w:p>
+      <w:pPr>
+        <w:spacing w:after="60"/>
+        <w:ind w:left="425" w:hanging="425"/>
+      </w:pPr>
+      <w:r>
+        <w:rPr>
+          <w:rFonts w:ascii="Times New Roman" w:hAnsi="Times New Roman"/>
+          <w:sz w:val="20"/>
+        </w:rPr>
+        <w:t>•   - bai-bao-Q1/HoiDong_DaoDuc_TraLoiNMD_08062026.docx (v1 trả lời 3 câu hỏi ban đầu)</w:t>
+      </w:r>
+    </w:p>
+    <w:p>
+      <w:pPr>
+        <w:spacing w:after="60"/>
+        <w:ind w:left="425" w:hanging="425"/>
+      </w:pPr>
+      <w:r>
+        <w:rPr>
+          <w:rFonts w:ascii="Times New Roman" w:hAnsi="Times New Roman"/>
+          <w:sz w:val="20"/>
+        </w:rPr>
+        <w:t>•   - bai-bao-Q1/MauQD_HoiDongDaoDuc_BANMAU_08062026.docx (mẫu trống)</w:t>
+      </w:r>
+    </w:p>
+    <w:p>
+      <w:pPr>
+        <w:spacing w:after="60"/>
+        <w:ind w:left="425" w:hanging="425"/>
+      </w:pPr>
+      <w:r>
+        <w:rPr>
+          <w:rFonts w:ascii="Times New Roman" w:hAnsi="Times New Roman"/>
+          <w:sz w:val="20"/>
+        </w:rPr>
+        <w:t>•   - bai-bao-Q1/MauQD_HoiDongDaoDuc_DIENSAN_08062026.docx (mẫu điền sẵn — đã update tên 3 bài chính thức)</w:t>
       </w:r>
     </w:p>
     <w:sectPr>

</xml_diff>

<commit_message>
TraLoiNMD doc polish: in-place 5 sua nho — (1) Q1-Q2 → Q1/Q2 (consistency); (2) tone softening 'hau nhu chac chan' → 'nhieu kha nang'; (3) 'Em tra loi thang' → 'Em xin tra loi thang' (le phep hon); (4) bo dau ngoac kep thua quanh ten Hoi dong; (5) chuan hoa Truong DHSPHN → Truong Dai hoc Su pham Ha Noi (formal); KHONG dung script .py
</commit_message>
<xml_diff>
--- a/bai-bao-Q1/TraLoiNMD_4CauHoiIRB_08062026.docx
+++ b/bai-bao-Q1/TraLoiNMD_4CauHoiIRB_08062026.docx
@@ -234,7 +234,7 @@
           <w:rFonts w:ascii="Times New Roman" w:hAnsi="Times New Roman"/>
           <w:sz w:val="22"/>
         </w:rPr>
-        <w:t>Em trả lời thẳng: KHÔNG TỰ ĐỘNG bị từ chối, nhưng sẽ có rủi ro. Có ba mức độ rủi ro tùy tạp chí:</w:t>
+        <w:t>Em xin trả lời thẳng: bài báo KHÔNG TỰ ĐỘNG bị từ chối, nhưng sẽ có rủi ro. Có ba mức độ rủi ro tùy tạp chí:</w:t>
       </w:r>
     </w:p>
     <w:p>
@@ -248,7 +248,7 @@
           <w:rFonts w:ascii="Times New Roman" w:hAnsi="Times New Roman"/>
           <w:sz w:val="22"/>
         </w:rPr>
-        <w:t>• Tạp chí Q1 hàng đầu (như Lancet Psychiatry, JAMA Psychiatry): hầu như chắc chắn từ chối nếu QĐ ngày sau khảo sát, trừ phi có lý do rất đặc biệt</w:t>
+        <w:t>• Tạp chí Q1 hàng đầu (như Lancet Psychiatry, JAMA Psychiatry): nhiều khả năng sẽ từ chối nếu QĐ ngày sau khảo sát, trừ phi có lý do rất đặc biệt</w:t>
       </w:r>
     </w:p>
     <w:p>
@@ -1258,7 +1258,7 @@
           <w:rFonts w:ascii="Times New Roman" w:hAnsi="Times New Roman"/>
           <w:sz w:val="22"/>
         </w:rPr>
-        <w:t>Kết luận cho câu này: Trong manuscript, chỉ cần ghi đầy đủ "tên Hội đồng + số QĐ + ngày phê duyệt + quy trình chấp thuận" là đủ về mặt hình thức. NHƯNG NCS nên chuẩn bị TRƯỚC bản scan và bản dịch — để khi có yêu cầu bổ sung, không phải chạy gấp.</w:t>
+        <w:t>Kết luận cho câu này: Trong manuscript, ghi đầy đủ tên Hội đồng + số QĐ + ngày phê duyệt + quy trình chấp thuận" là đủ về mặt hình thức. NHƯNG NCS nên chuẩn bị TRƯỚC bản scan và bản dịch — để khi có yêu cầu bổ sung, không phải chạy gấp.</w:t>
       </w:r>
     </w:p>
     <w:p>
@@ -1963,7 +1963,7 @@
           <w:color w:val="C00000"/>
           <w:sz w:val="26"/>
         </w:rPr>
-        <w:t>PHẦN III — 5 BƯỚC HÀNH ĐỘNG CHO NHÓM (THEO THỨ TỰ ƯU TIÊN)</w:t>
+        <w:t>PHẦN III — 5 BƯỚC HÀNH ĐỘNG CHO NHÓM (theo thứ tự ưu tiên)</w:t>
       </w:r>
     </w:p>
     <w:p>

</xml_diff>

<commit_message>
TraLoiNMD doc polish: (1) fix typo 'toa san' → 'toa soan' theo yeu cau user; (2) bo cac chem tieng Anh khong can thiet trong body — informed consent/assent/Letter of School Permission/secondary analysis/ratification/predatory journals/desk rejection/approval certificate or letter/Ethics Statement → VN equivalents; KHONG dung script .py
</commit_message>
<xml_diff>
--- a/bai-bao-Q1/TraLoiNMD_4CauHoiIRB_08062026.docx
+++ b/bai-bao-Q1/TraLoiNMD_4CauHoiIRB_08062026.docx
@@ -506,7 +506,7 @@
           <w:rFonts w:ascii="Times New Roman" w:hAnsi="Times New Roman"/>
           <w:sz w:val="22"/>
         </w:rPr>
-        <w:t>• Hiệu trưởng Trường THCS Nhật Tân và Trường THCS Tây Mỗ ký thư cho phép thu dữ liệu (Letter of School Permission) — đây là bằng chứng đạo đức tạm thời cho giai đoạn đã thu</w:t>
+        <w:t>• Hiệu trưởng Trường THCS Nhật Tân và Trường THCS Tây Mỗ ký thư cho phép thu dữ liệu — đây là bằng chứng đạo đức tạm thời cho giai đoạn đã thu</w:t>
       </w:r>
     </w:p>
     <w:p>
@@ -693,7 +693,7 @@
           <w:rFonts w:ascii="Times New Roman" w:hAnsi="Times New Roman"/>
           <w:sz w:val="22"/>
         </w:rPr>
-        <w:t>Khái niệm: "phân tích thứ cấp" (secondary analysis) là việc dùng dữ liệu đã thu trước đó cho mục đích nghiên cứu mới. Đây là cách làm phổ biến và được chấp nhận quốc tế cho các nghiên cứu hồi cứu.</w:t>
+        <w:t>Khái niệm: "phân tích thứ cấp" là việc dùng dữ liệu đã thu trước đó cho mục đích nghiên cứu mới. Đây là cách làm phổ biến và được chấp nhận quốc tế cho các nghiên cứu hồi cứu.</w:t>
       </w:r>
     </w:p>
     <w:p>
@@ -787,7 +787,7 @@
           <w:color w:val="804000"/>
           <w:sz w:val="22"/>
         </w:rPr>
-        <w:t>Giải pháp 3 — Đề nghị phê duyệt hồi tố (ratification)</w:t>
+        <w:t>Giải pháp 3 — Đề nghị phê duyệt hồi tố</w:t>
       </w:r>
     </w:p>
     <w:p>
@@ -970,7 +970,7 @@
           <w:color w:val="C00000"/>
           <w:sz w:val="22"/>
         </w:rPr>
-        <w:t xml:space="preserve">Câu hỏi thầy NMĐ: </w:t>
+        <w:t>Câu hỏi thầy NMĐ: "QĐ có cần phải dịch ra tiếng Anh để trình tòa soạn các Tạp chí QT hay chỉ cần ghi số và ngày của QĐ đạo đức là được?"</w:t>
       </w:r>
       <w:r>
         <w:rPr>
@@ -978,7 +978,6 @@
           <w:i/>
           <w:sz w:val="22"/>
         </w:rPr>
-        <w:t>"QĐ có cần phải dịch ra tiếng Anh để trình tòa sạn các Tạp chí QT hay chỉ cần ghi số và ngày của QĐ đạo đức là được?"</w:t>
       </w:r>
     </w:p>
     <w:p>
@@ -1020,7 +1019,7 @@
           <w:rFonts w:ascii="Times New Roman" w:hAnsi="Times New Roman"/>
           <w:sz w:val="22"/>
         </w:rPr>
-        <w:t>Mọi tạp chí Q1/Q2 quốc tế đều yêu cầu trong phần Phương pháp (Ethics Statement) các thông tin sau:</w:t>
+        <w:t>Mọi tạp chí Q1/Q2 quốc tế đều yêu cầu trong phần Phương pháp (Tuyên bố đạo đức) các thông tin sau:</w:t>
       </w:r>
     </w:p>
     <w:p>
@@ -1216,7 +1215,7 @@
           <w:rFonts w:ascii="Times New Roman" w:hAnsi="Times New Roman"/>
           <w:sz w:val="22"/>
         </w:rPr>
-        <w:t>• BMC (toàn bộ chuỗi BMC): yêu cầu "approval certificate or letter" khi xác minh; bản dịch tiếng Anh được khuyến nghị mạnh</w:t>
+        <w:t>• BMC (toàn bộ chuỗi BMC): yêu cầu "chứng nhận hoặc thư phê duyệt" khi xác minh; bản dịch tiếng Anh được khuyến nghị mạnh</w:t>
       </w:r>
     </w:p>
     <w:p>
@@ -1477,7 +1476,7 @@
           <w:rFonts w:ascii="Times New Roman" w:hAnsi="Times New Roman"/>
           <w:sz w:val="22"/>
         </w:rPr>
-        <w:t>Nhiều tạp chí cấp này chấp nhận statement đơn giản như "approved by the Ethics Committee" — nhưng đây là dấu hiệu của các tạp chí kém uy tín hoặc tạp chí ăn cướp (predatory journals) mà nhóm KHÔNG nên nhắm tới.</w:t>
+        <w:t>Nhiều tạp chí cấp này chấp nhận statement đơn giản như "approved by the Ethics Committee" — nhưng đây là dấu hiệu của các tạp chí kém uy tín hoặc tạp chí ăn cướp mà nhóm KHÔNG nên nhắm tới.</w:t>
       </w:r>
     </w:p>
     <w:p>
@@ -1519,7 +1518,7 @@
           <w:rFonts w:ascii="Times New Roman" w:hAnsi="Times New Roman"/>
           <w:sz w:val="22"/>
         </w:rPr>
-        <w:t>• Rủi ro 1 — Từ chối ngay tại bàn biên tập (desk rejection): tạp chí Q1/Q2 sẽ từ chối nếu thấy Ethics Statement thiếu chi tiết</w:t>
+        <w:t>• Rủi ro 1 — Từ chối ngay tại bàn biên tập: tạp chí Q1/Q2 sẽ từ chối nếu thấy tuyên bố đạo đức thiếu chi tiết</w:t>
       </w:r>
     </w:p>
     <w:p>

</xml_diff>

<commit_message>
TraLoiNMD doc — tat ca thuan Viet theo yeu cau: xoa 2 paragraph English template (Cau mau Methods + Tuyen bo quy trinh) o Giai phap 1 + Cau 3; VN hoa para 'Thu thap bang chung informed consent + school permission' → 'dong y cua cha me + thu cho phep cua nha truong'; giu lai ten tap chi/to chuc/PMID/DOI/3 ten bai Q2-Q3-Q4 (la ten rieng + reference)
</commit_message>
<xml_diff>
--- a/bai-bao-Q1/TraLoiNMD_4CauHoiIRB_08062026.docx
+++ b/bai-bao-Q1/TraLoiNMD_4CauHoiIRB_08062026.docx
@@ -627,20 +627,6 @@
           <w:rFonts w:ascii="Times New Roman" w:hAnsi="Times New Roman"/>
           <w:sz w:val="22"/>
         </w:rPr>
-        <w:t>Bản tiếng Anh em đề xuất: "Ethics approval was obtained for data analysis and publication purposes from the Research Ethics Committee of Hanoi National University of Education (Approval No. XXX, dated YYY), after the initial phase of data collection. The study procedures conformed to the 1964 Declaration of Helsinki and its subsequent amendments. Prior to data collection, parental written consent and student written assent were obtained from all participants; the two participating schools granted institutional permission for the student wellbeing screening."</w:t>
-      </w:r>
-    </w:p>
-    <w:p>
-      <w:pPr>
-        <w:spacing w:after="80"/>
-        <w:ind w:firstLine="283"/>
-        <w:jc w:val="both"/>
-      </w:pPr>
-      <w:r>
-        <w:rPr>
-          <w:rFonts w:ascii="Times New Roman" w:hAnsi="Times New Roman"/>
-          <w:sz w:val="22"/>
-        </w:rPr>
         <w:t>Bản tiếng Việt: "Quyết định phê duyệt đạo đức cho việc phân tích và công bố được Hội đồng Đạo đức Trường Đại học Sư phạm Hà Nội cấp ngày YYY (số QĐ XXX), sau giai đoạn thu dữ liệu ban đầu. Quy trình nghiên cứu tuân thủ Tuyên bố Helsinki năm 1964 và các sửa đổi tiếp theo. Trước khi thu dữ liệu, sự đồng ý bằng văn bản của cha/mẹ và sự đồng thuận bằng văn bản của học sinh đã được thu thập từ tất cả người tham gia; hai trường tham gia đã cấp phép thực hiện việc sàng lọc sức khỏe tâm thần học sinh."</w:t>
       </w:r>
     </w:p>
@@ -1075,20 +1061,6 @@
           <w:rFonts w:ascii="Times New Roman" w:hAnsi="Times New Roman"/>
           <w:sz w:val="22"/>
         </w:rPr>
-        <w:t>• Tuyên bố quy trình lấy chấp thuận: "Written informed consent was obtained from all parents/guardians and written assent was obtained from all student participants prior to data collection."</w:t>
-      </w:r>
-    </w:p>
-    <w:p>
-      <w:pPr>
-        <w:spacing w:after="60"/>
-        <w:ind w:left="425"/>
-        <w:jc w:val="both"/>
-      </w:pPr>
-      <w:r>
-        <w:rPr>
-          <w:rFonts w:ascii="Times New Roman" w:hAnsi="Times New Roman"/>
-          <w:sz w:val="22"/>
-        </w:rPr>
         <w:t>• Tham chiếu Tuyên bố Helsinki: "The study was conducted in accordance with the Declaration of Helsinki."</w:t>
       </w:r>
     </w:p>
@@ -2158,7 +2130,7 @@
           <w:rFonts w:ascii="Times New Roman" w:hAnsi="Times New Roman"/>
           <w:sz w:val="22"/>
         </w:rPr>
-        <w:t>• Thu thập bằng chứng informed consent + school permission đã có TRƯỚC thu dữ liệu — đây là tấm khiên bảo vệ trong vòng phản hồi</w:t>
+        <w:t>• Thu thập bằng chứng đồng ý của cha mẹ + thư cho phép của nhà trường đã có TRƯỚC thu dữ liệu — đây là tấm khiên bảo vệ trong vòng phản hồi</w:t>
       </w:r>
     </w:p>
     <w:p>

</xml_diff>

<commit_message>
TraLoiNMD doc — fix English chêm: statement → tuyên bố, retraction → rút bài, manuscript → bản thảo, reviewer → người phản biện (user feedback example: 'có tạp chí nào chỉ cần statement' → 'có tạp chí nào chỉ cần tuyên bố')
</commit_message>
<xml_diff>
--- a/bai-bao-Q1/TraLoiNMD_4CauHoiIRB_08062026.docx
+++ b/bai-bao-Q1/TraLoiNMD_4CauHoiIRB_08062026.docx
@@ -113,7 +113,7 @@
           <w:rFonts w:ascii="Times New Roman" w:hAnsi="Times New Roman"/>
           <w:sz w:val="22"/>
         </w:rPr>
-        <w:t>• Câu 3 (có cần dịch tiếng Anh?): Có — chuẩn bị 2 bản (gốc + dịch) là an toàn nhất. PLOS bắt buộc; Frontiers/BMC yêu cầu khi reviewer hỏi.</w:t>
+        <w:t>• Câu 3 (có cần dịch tiếng Anh?): Có — chuẩn bị 2 bản (gốc + dịch) là an toàn nhất. PLOS bắt buộc; Frontiers/BMC yêu cầu khi người phản biện hỏi.</w:t>
       </w:r>
     </w:p>
     <w:p>
@@ -127,7 +127,7 @@
           <w:rFonts w:ascii="Times New Roman" w:hAnsi="Times New Roman"/>
           <w:sz w:val="22"/>
         </w:rPr>
-        <w:t>• Câu 4 (có tạp chí nào chỉ cần statement?): Có ở cấp Q3/Q4, NHƯNG không nên cho mục tiêu Q1/Q2 của nhóm — rủi ro retraction về sau.</w:t>
+        <w:t>• Câu 4 (có tạp chí nào chỉ cần tuyên bố?): Có ở cấp Q3/Q4, NHƯNG không nên cho mục tiêu Q1/Q2 của nhóm — rủi ro rút bài về sau.</w:t>
       </w:r>
     </w:p>
     <w:p>
@@ -613,7 +613,7 @@
           <w:rFonts w:ascii="Times New Roman" w:hAnsi="Times New Roman"/>
           <w:sz w:val="22"/>
         </w:rPr>
-        <w:t>Đây là giải pháp cốt lõi mà mọi nghiên cứu ở tình huống này phải làm. Trong manuscript, ghi rõ trong phần Phương pháp một đoạn như sau:</w:t>
+        <w:t>Đây là giải pháp cốt lõi mà mọi nghiên cứu ở tình huống này phải làm. Trong bản thảo, ghi rõ trong phần Phương pháp một đoạn như sau:</w:t>
       </w:r>
     </w:p>
     <w:p>
@@ -991,7 +991,7 @@
           <w:color w:val="804000"/>
           <w:sz w:val="22"/>
         </w:rPr>
-        <w:t>Mức tối thiểu — BẮT BUỘC phải có trong manuscript</w:t>
+        <w:t>Mức tối thiểu — BẮT BUỘC phải có trong bản thảo</w:t>
       </w:r>
     </w:p>
     <w:p>
@@ -1145,7 +1145,7 @@
           <w:rFonts w:ascii="Times New Roman" w:hAnsi="Times New Roman"/>
           <w:sz w:val="22"/>
         </w:rPr>
-        <w:t>• Khi nộp manuscript, có thể đính kèm cả hai bản vào Supplementary Files nếu tạp chí cho phép, hoặc giữ sẵn để gửi khi có yêu cầu</w:t>
+        <w:t>• Khi nộp bản thảo, có thể đính kèm cả hai bản vào Supplementary Files nếu tạp chí cho phép, hoặc giữ sẵn để gửi khi có yêu cầu</w:t>
       </w:r>
     </w:p>
     <w:p>
@@ -1229,7 +1229,7 @@
           <w:rFonts w:ascii="Times New Roman" w:hAnsi="Times New Roman"/>
           <w:sz w:val="22"/>
         </w:rPr>
-        <w:t>Kết luận cho câu này: Trong manuscript, ghi đầy đủ tên Hội đồng + số QĐ + ngày phê duyệt + quy trình chấp thuận" là đủ về mặt hình thức. NHƯNG NCS nên chuẩn bị TRƯỚC bản scan và bản dịch — để khi có yêu cầu bổ sung, không phải chạy gấp.</w:t>
+        <w:t>Kết luận cho câu này: Trong bản thảo, ghi đầy đủ tên Hội đồng + số QĐ + ngày phê duyệt + quy trình chấp thuận" là đủ về mặt hình thức. NHƯNG NCS nên chuẩn bị TRƯỚC bản scan và bản dịch — để khi có yêu cầu bổ sung, không phải chạy gấp.</w:t>
       </w:r>
     </w:p>
     <w:p>
@@ -1243,7 +1243,7 @@
           <w:color w:val="2E74B5"/>
           <w:sz w:val="24"/>
         </w:rPr>
-        <w:t>1.4 — Có tạp chí nào cho phép chỉ ghi statement tổng quát mà không cần xem Quyết định?</w:t>
+        <w:t>1.4 — Có tạp chí nào cho phép chỉ ghi tuyên bố tổng quát mà không cần xem Quyết định?</w:t>
       </w:r>
     </w:p>
     <w:p>
@@ -1322,7 +1322,7 @@
           <w:rFonts w:ascii="Times New Roman" w:hAnsi="Times New Roman"/>
           <w:sz w:val="22"/>
         </w:rPr>
-        <w:t>• Tên Hội đồng + số QĐ + ngày phê duyệt trong manuscript (BẮT BUỘC)</w:t>
+        <w:t>• Tên Hội đồng + số QĐ + ngày phê duyệt trong bản thảo (BẮT BUỘC)</w:t>
       </w:r>
     </w:p>
     <w:p>
@@ -1364,7 +1364,7 @@
           <w:rFonts w:ascii="Times New Roman" w:hAnsi="Times New Roman"/>
           <w:sz w:val="22"/>
         </w:rPr>
-        <w:t>Statement tổng quát kiểu "the study was approved by the Ethics Committee" mà không có chi tiết sẽ bị biên tập đánh giá thiếu chính xác — có thể bị từ chối ngay hoặc yêu cầu bổ sung trong vòng phản hồi đầu tiên.</w:t>
+        <w:t>Tuyên bố tổng quát kiểu "the study was approved by the Ethics Committee" mà không có chi tiết sẽ bị biên tập đánh giá thiếu chính xác — có thể bị từ chối ngay hoặc yêu cầu bổ sung trong vòng phản hồi đầu tiên.</w:t>
       </w:r>
     </w:p>
     <w:p>
@@ -1392,7 +1392,7 @@
           <w:rFonts w:ascii="Times New Roman" w:hAnsi="Times New Roman"/>
           <w:sz w:val="22"/>
         </w:rPr>
-        <w:t>Một số tạp chí khu vực hoặc chuyên ngành cấp Q3 chấp nhận statement ngắn gọn hơn:</w:t>
+        <w:t>Một số tạp chí khu vực hoặc chuyên ngành cấp Q3 chấp nhận tuyên bố ngắn gọn hơn:</w:t>
       </w:r>
     </w:p>
     <w:p>
@@ -1448,7 +1448,7 @@
           <w:rFonts w:ascii="Times New Roman" w:hAnsi="Times New Roman"/>
           <w:sz w:val="22"/>
         </w:rPr>
-        <w:t>Nhiều tạp chí cấp này chấp nhận statement đơn giản như "approved by the Ethics Committee" — nhưng đây là dấu hiệu của các tạp chí kém uy tín hoặc tạp chí ăn cướp mà nhóm KHÔNG nên nhắm tới.</w:t>
+        <w:t>Nhiều tạp chí cấp này chấp nhận tuyên bố đơn giản như "approved by the Ethics Committee" — nhưng đây là dấu hiệu của các tạp chí kém uy tín hoặc tạp chí ăn cướp mà nhóm KHÔNG nên nhắm tới.</w:t>
       </w:r>
     </w:p>
     <w:p>
@@ -1462,7 +1462,7 @@
           <w:color w:val="804000"/>
           <w:sz w:val="22"/>
         </w:rPr>
-        <w:t>Rủi ro nếu chỉ ghi statement tổng quát mà không có Quyết định thực tế</w:t>
+        <w:t>Rủi ro nếu chỉ ghi tuyên bố tổng quát mà không có Quyết định thực tế</w:t>
       </w:r>
     </w:p>
     <w:p>
@@ -1518,7 +1518,7 @@
           <w:rFonts w:ascii="Times New Roman" w:hAnsi="Times New Roman"/>
           <w:sz w:val="22"/>
         </w:rPr>
-        <w:t>• Rủi ro 3 — Rút bài sau khi đã công bố (retraction): nếu sau công bố mà có audit hoặc người tố cáo phát hiện không có QĐ thực tế, tạp chí sẽ retract — đây là vết đen vĩnh viễn cho nhóm tác giả</w:t>
+        <w:t>• Rủi ro 3 — Rút bài sau khi đã công bố (rút bài): nếu sau công bố mà có audit hoặc người tố cáo phát hiện không có QĐ thực tế, tạp chí sẽ retract — đây là vết đen vĩnh viễn cho nhóm tác giả</w:t>
       </w:r>
     </w:p>
     <w:p>

</xml_diff>